<commit_message>
new white paper version added
</commit_message>
<xml_diff>
--- a/docs/twin_cessna_accident_database_white_paper_2026-04-25.docx
+++ b/docs/twin_cessna_accident_database_white_paper_2026-04-25.docx
@@ -88,7 +88,15 @@
       </w:pPr>
       <w:r>
         <w:rPr/>
-        <w:t>**dataset_size_total:** 191 accidents</w:t>
+        <w:t xml:space="preserve">**dataset_size_total:** </w:t>
+      </w:r>
+      <w:r>
+        <w:rPr/>
+        <w:t>227</w:t>
+      </w:r>
+      <w:r>
+        <w:rPr/>
+        <w:t xml:space="preserve"> accidents</w:t>
       </w:r>
     </w:p>
     <w:p>
@@ -102,7 +110,23 @@
       </w:pPr>
       <w:r>
         <w:rPr/>
-        <w:t>**dataset_size_per_model:** C310: 137; C340: 27; C402: 27</w:t>
+        <w:t xml:space="preserve">**dataset_size_per_model:** C310: 137; </w:t>
+      </w:r>
+      <w:r>
+        <w:rPr/>
+        <w:t xml:space="preserve">C320: 15; </w:t>
+      </w:r>
+      <w:r>
+        <w:rPr/>
+        <w:t xml:space="preserve">C340: </w:t>
+      </w:r>
+      <w:r>
+        <w:rPr/>
+        <w:t>48</w:t>
+      </w:r>
+      <w:r>
+        <w:rPr/>
+        <w:t>; C402: 27</w:t>
       </w:r>
     </w:p>
     <w:p>
@@ -116,7 +140,15 @@
       </w:pPr>
       <w:r>
         <w:rPr/>
-        <w:t>**unknown_factor_rate:** 0.2778 assignment-based</w:t>
+        <w:t>**unknown_factor_rate:** 0.2</w:t>
+      </w:r>
+      <w:r>
+        <w:rPr/>
+        <w:t>56</w:t>
+      </w:r>
+      <w:r>
+        <w:rPr/>
+        <w:t xml:space="preserve"> assignment-based</w:t>
       </w:r>
     </w:p>
     <w:p>
@@ -296,17 +328,61 @@
       </w:r>
       <w:r>
         <w:rPr/>
-        <w:t xml:space="preserve">, only the </w:t>
+        <w:t xml:space="preserve">, </w:t>
+      </w:r>
+      <w:r>
+        <w:rPr/>
+        <w:t>t</w:t>
+      </w:r>
+      <w:r>
+        <w:rPr/>
+        <w:t xml:space="preserve">he </w:t>
       </w:r>
       <w:r>
         <w:rPr>
           <w:b/>
         </w:rPr>
-        <w:t>Cessna 310 dataset is complete for the 2006–2026 period</w:t>
+        <w:t xml:space="preserve">Cessna 310, </w:t>
       </w:r>
       <w:r>
-        <w:rPr/>
-        <w:t>. C340 and C402 records are included in the current fleet analysis and have crossed the minimum pattern-summary gate, but those model slices remain in progress. More models in the Twin Cessna fleet are coming soon. For committee use, this means the fleet-level findings are mature enough to guide near-term safety discussion, while model-specific comparison language should remain carefully qualified until additional model histories are completed.</w:t>
+        <w:rPr>
+          <w:b/>
+        </w:rPr>
+        <w:t xml:space="preserve">320, and 340 </w:t>
+      </w:r>
+      <w:r>
+        <w:rPr>
+          <w:b/>
+        </w:rPr>
+        <w:t>datase</w:t>
+      </w:r>
+      <w:r>
+        <w:rPr>
+          <w:b/>
+        </w:rPr>
+        <w:t>ts</w:t>
+      </w:r>
+      <w:r>
+        <w:rPr>
+          <w:b/>
+        </w:rPr>
+        <w:t xml:space="preserve"> </w:t>
+      </w:r>
+      <w:r>
+        <w:rPr>
+          <w:b/>
+        </w:rPr>
+        <w:t>are</w:t>
+      </w:r>
+      <w:r>
+        <w:rPr>
+          <w:b/>
+        </w:rPr>
+        <w:t xml:space="preserve"> complete for the 2006–2026 period</w:t>
+      </w:r>
+      <w:r>
+        <w:rPr/>
+        <w:t>. C402 records are included in the current fleet analysis and have crossed the minimum pattern-summary gate, but those model slices remain in progress. More models in the Twin Cessna fleet are coming soon. For committee use, this means the fleet-level findings are mature enough to guide near-term safety discussion, while model-specific comparison language should remain carefully qualified until additional model histories are completed.</w:t>
       </w:r>
     </w:p>
     <w:p>
@@ -369,7 +445,15 @@
       </w:pPr>
       <w:r>
         <w:rPr/>
-        <w:t>Aircraft included in the current fleet summary: C310, C340, and C402.</w:t>
+        <w:t xml:space="preserve">Aircraft included in the current fleet summary: C310, </w:t>
+      </w:r>
+      <w:r>
+        <w:rPr/>
+        <w:t xml:space="preserve">C320, </w:t>
+      </w:r>
+      <w:r>
+        <w:rPr/>
+        <w:t>C340, and C402.</w:t>
       </w:r>
     </w:p>
     <w:p>
@@ -484,7 +568,10 @@
         </w:rPr>
       </w:pPr>
       <w:r>
-        <w:rPr/>
+        <w:rPr>
+          <w:rFonts w:ascii="Courier New" w:hAnsi="Courier New"/>
+          <w:sz w:val="14"/>
+        </w:rPr>
       </w:r>
     </w:p>
     <w:tbl>
@@ -504,8 +591,8 @@
         <w:gridCol w:w="739"/>
         <w:gridCol w:w="768"/>
         <w:gridCol w:w="605"/>
-        <w:gridCol w:w="837"/>
-        <w:gridCol w:w="3902"/>
+        <w:gridCol w:w="836"/>
+        <w:gridCol w:w="3903"/>
       </w:tblGrid>
       <w:tr>
         <w:trPr>
@@ -573,7 +660,7 @@
         </w:tc>
         <w:tc>
           <w:tcPr>
-            <w:tcW w:w="837" w:type="dxa"/>
+            <w:tcW w:w="836" w:type="dxa"/>
             <w:tcBorders/>
             <w:vAlign w:val="center"/>
           </w:tcPr>
@@ -593,7 +680,7 @@
         </w:tc>
         <w:tc>
           <w:tcPr>
-            <w:tcW w:w="3902" w:type="dxa"/>
+            <w:tcW w:w="3903" w:type="dxa"/>
             <w:tcBorders/>
             <w:vAlign w:val="center"/>
           </w:tcPr>
@@ -676,7 +763,7 @@
         </w:tc>
         <w:tc>
           <w:tcPr>
-            <w:tcW w:w="837" w:type="dxa"/>
+            <w:tcW w:w="836" w:type="dxa"/>
             <w:tcBorders/>
             <w:vAlign w:val="center"/>
           </w:tcPr>
@@ -696,21 +783,25 @@
         </w:tc>
         <w:tc>
           <w:tcPr>
-            <w:tcW w:w="3902" w:type="dxa"/>
-            <w:tcBorders/>
-            <w:vAlign w:val="center"/>
-          </w:tcPr>
-          <w:p>
-            <w:pPr>
-              <w:pStyle w:val="TableContents"/>
-              <w:widowControl w:val="false"/>
-              <w:suppressLineNumbers/>
-              <w:spacing w:before="0" w:after="200"/>
-              <w:rPr/>
-            </w:pPr>
-            <w:r>
-              <w:rPr/>
-              <w:t>Only fully complete dataset (2006–2026)</w:t>
+            <w:tcW w:w="3903" w:type="dxa"/>
+            <w:tcBorders/>
+            <w:vAlign w:val="center"/>
+          </w:tcPr>
+          <w:p>
+            <w:pPr>
+              <w:pStyle w:val="TableContents"/>
+              <w:widowControl w:val="false"/>
+              <w:suppressLineNumbers/>
+              <w:spacing w:before="0" w:after="200"/>
+              <w:rPr/>
+            </w:pPr>
+            <w:r>
+              <w:rPr/>
+              <w:t>f</w:t>
+            </w:r>
+            <w:r>
+              <w:rPr/>
+              <w:t>ully complete dataset (2006–2026)</w:t>
             </w:r>
           </w:p>
         </w:tc>
@@ -733,7 +824,7 @@
             </w:pPr>
             <w:r>
               <w:rPr/>
-              <w:t>C340</w:t>
+              <w:t>C320</w:t>
             </w:r>
           </w:p>
         </w:tc>
@@ -753,7 +844,7 @@
             </w:pPr>
             <w:r>
               <w:rPr/>
-              <w:t>27</w:t>
+              <w:t>15</w:t>
             </w:r>
           </w:p>
         </w:tc>
@@ -773,47 +864,47 @@
             </w:pPr>
             <w:r>
               <w:rPr/>
-              <w:t>14</w:t>
-            </w:r>
-          </w:p>
-        </w:tc>
-        <w:tc>
-          <w:tcPr>
-            <w:tcW w:w="837" w:type="dxa"/>
-            <w:tcBorders/>
-            <w:vAlign w:val="center"/>
-          </w:tcPr>
-          <w:p>
-            <w:pPr>
-              <w:pStyle w:val="TableContents"/>
-              <w:widowControl w:val="false"/>
-              <w:suppressLineNumbers/>
-              <w:spacing w:before="0" w:after="200"/>
-              <w:rPr/>
-            </w:pPr>
-            <w:r>
-              <w:rPr/>
-              <w:t>52%</w:t>
-            </w:r>
-          </w:p>
-        </w:tc>
-        <w:tc>
-          <w:tcPr>
-            <w:tcW w:w="3902" w:type="dxa"/>
-            <w:tcBorders/>
-            <w:vAlign w:val="center"/>
-          </w:tcPr>
-          <w:p>
-            <w:pPr>
-              <w:pStyle w:val="TableContents"/>
-              <w:widowControl w:val="false"/>
-              <w:suppressLineNumbers/>
-              <w:spacing w:before="0" w:after="200"/>
-              <w:rPr/>
-            </w:pPr>
-            <w:r>
-              <w:rPr/>
-              <w:t>Small sample; higher fatal share</w:t>
+              <w:t>9</w:t>
+            </w:r>
+          </w:p>
+        </w:tc>
+        <w:tc>
+          <w:tcPr>
+            <w:tcW w:w="836" w:type="dxa"/>
+            <w:tcBorders/>
+            <w:vAlign w:val="center"/>
+          </w:tcPr>
+          <w:p>
+            <w:pPr>
+              <w:pStyle w:val="TableContents"/>
+              <w:widowControl w:val="false"/>
+              <w:suppressLineNumbers/>
+              <w:spacing w:before="0" w:after="200"/>
+              <w:rPr/>
+            </w:pPr>
+            <w:r>
+              <w:rPr/>
+              <w:t>60%</w:t>
+            </w:r>
+          </w:p>
+        </w:tc>
+        <w:tc>
+          <w:tcPr>
+            <w:tcW w:w="3903" w:type="dxa"/>
+            <w:tcBorders/>
+            <w:vAlign w:val="center"/>
+          </w:tcPr>
+          <w:p>
+            <w:pPr>
+              <w:pStyle w:val="TableContents"/>
+              <w:widowControl w:val="false"/>
+              <w:suppressLineNumbers/>
+              <w:spacing w:before="0" w:after="200"/>
+              <w:rPr/>
+            </w:pPr>
+            <w:r>
+              <w:rPr/>
+              <w:t>Fully complete dataset, small sample</w:t>
             </w:r>
           </w:p>
         </w:tc>
@@ -836,6 +927,117 @@
             </w:pPr>
             <w:r>
               <w:rPr/>
+              <w:t>C340</w:t>
+            </w:r>
+          </w:p>
+        </w:tc>
+        <w:tc>
+          <w:tcPr>
+            <w:tcW w:w="768" w:type="dxa"/>
+            <w:tcBorders/>
+            <w:vAlign w:val="center"/>
+          </w:tcPr>
+          <w:p>
+            <w:pPr>
+              <w:pStyle w:val="TableContents"/>
+              <w:widowControl w:val="false"/>
+              <w:suppressLineNumbers/>
+              <w:spacing w:before="0" w:after="200"/>
+              <w:rPr/>
+            </w:pPr>
+            <w:r>
+              <w:rPr/>
+              <w:t>48</w:t>
+            </w:r>
+          </w:p>
+        </w:tc>
+        <w:tc>
+          <w:tcPr>
+            <w:tcW w:w="605" w:type="dxa"/>
+            <w:tcBorders/>
+            <w:vAlign w:val="center"/>
+          </w:tcPr>
+          <w:p>
+            <w:pPr>
+              <w:pStyle w:val="TableContents"/>
+              <w:widowControl w:val="false"/>
+              <w:suppressLineNumbers/>
+              <w:spacing w:before="0" w:after="200"/>
+              <w:rPr/>
+            </w:pPr>
+            <w:r>
+              <w:rPr/>
+              <w:t>20</w:t>
+            </w:r>
+          </w:p>
+        </w:tc>
+        <w:tc>
+          <w:tcPr>
+            <w:tcW w:w="836" w:type="dxa"/>
+            <w:tcBorders/>
+            <w:vAlign w:val="center"/>
+          </w:tcPr>
+          <w:p>
+            <w:pPr>
+              <w:pStyle w:val="TableContents"/>
+              <w:widowControl w:val="false"/>
+              <w:suppressLineNumbers/>
+              <w:spacing w:before="0" w:after="200"/>
+              <w:rPr/>
+            </w:pPr>
+            <w:r>
+              <w:rPr/>
+              <w:t>42</w:t>
+            </w:r>
+            <w:r>
+              <w:rPr/>
+              <w:t>%</w:t>
+            </w:r>
+          </w:p>
+        </w:tc>
+        <w:tc>
+          <w:tcPr>
+            <w:tcW w:w="3903" w:type="dxa"/>
+            <w:tcBorders/>
+            <w:vAlign w:val="center"/>
+          </w:tcPr>
+          <w:p>
+            <w:pPr>
+              <w:pStyle w:val="TableContents"/>
+              <w:widowControl w:val="false"/>
+              <w:suppressLineNumbers/>
+              <w:spacing w:before="0" w:after="200"/>
+              <w:rPr/>
+            </w:pPr>
+            <w:r>
+              <w:rPr/>
+              <w:t>Complete dataset</w:t>
+            </w:r>
+            <w:r>
+              <w:rPr/>
+              <w:t>; higher fatal share</w:t>
+            </w:r>
+          </w:p>
+        </w:tc>
+      </w:tr>
+      <w:tr>
+        <w:trPr/>
+        <w:tc>
+          <w:tcPr>
+            <w:tcW w:w="739" w:type="dxa"/>
+            <w:tcBorders/>
+            <w:vAlign w:val="center"/>
+          </w:tcPr>
+          <w:p>
+            <w:pPr>
+              <w:pStyle w:val="TableContents"/>
+              <w:widowControl w:val="false"/>
+              <w:suppressLineNumbers/>
+              <w:spacing w:before="0" w:after="200"/>
+              <w:rPr/>
+            </w:pPr>
+            <w:r>
+              <w:rPr/>
               <w:t>C402</w:t>
             </w:r>
           </w:p>
@@ -882,7 +1084,7 @@
         </w:tc>
         <w:tc>
           <w:tcPr>
-            <w:tcW w:w="837" w:type="dxa"/>
+            <w:tcW w:w="836" w:type="dxa"/>
             <w:tcBorders/>
             <w:vAlign w:val="center"/>
           </w:tcPr>
@@ -902,7 +1104,7 @@
         </w:tc>
         <w:tc>
           <w:tcPr>
-            <w:tcW w:w="3902" w:type="dxa"/>
+            <w:tcW w:w="3903" w:type="dxa"/>
             <w:tcBorders/>
             <w:vAlign w:val="center"/>
           </w:tcPr>
@@ -963,7 +1165,7 @@
               <w:rPr>
                 <w:rStyle w:val="Strong"/>
               </w:rPr>
-              <w:t>191</w:t>
+              <w:t>227</w:t>
             </w:r>
           </w:p>
         </w:tc>
@@ -985,13 +1187,13 @@
               <w:rPr>
                 <w:rStyle w:val="Strong"/>
               </w:rPr>
-              <w:t>66</w:t>
-            </w:r>
-          </w:p>
-        </w:tc>
-        <w:tc>
-          <w:tcPr>
-            <w:tcW w:w="837" w:type="dxa"/>
+              <w:t>81</w:t>
+            </w:r>
+          </w:p>
+        </w:tc>
+        <w:tc>
+          <w:tcPr>
+            <w:tcW w:w="836" w:type="dxa"/>
             <w:tcBorders/>
             <w:vAlign w:val="center"/>
           </w:tcPr>
@@ -1007,27 +1209,43 @@
               <w:rPr>
                 <w:rStyle w:val="Strong"/>
               </w:rPr>
-              <w:t>35%</w:t>
-            </w:r>
-          </w:p>
-        </w:tc>
-        <w:tc>
-          <w:tcPr>
-            <w:tcW w:w="3902" w:type="dxa"/>
-            <w:tcBorders/>
-            <w:vAlign w:val="center"/>
-          </w:tcPr>
-          <w:p>
-            <w:pPr>
-              <w:pStyle w:val="TableContents"/>
-              <w:widowControl w:val="false"/>
-              <w:suppressLineNumbers/>
-              <w:spacing w:before="0" w:after="200"/>
-              <w:rPr/>
-            </w:pPr>
-            <w:r>
-              <w:rPr/>
-              <w:t>C310 complete; others still in progress</w:t>
+              <w:t>3</w:t>
+            </w:r>
+            <w:r>
+              <w:rPr>
+                <w:rStyle w:val="Strong"/>
+              </w:rPr>
+              <w:t>6</w:t>
+            </w:r>
+            <w:r>
+              <w:rPr>
+                <w:rStyle w:val="Strong"/>
+              </w:rPr>
+              <w:t>%</w:t>
+            </w:r>
+          </w:p>
+        </w:tc>
+        <w:tc>
+          <w:tcPr>
+            <w:tcW w:w="3903" w:type="dxa"/>
+            <w:tcBorders/>
+            <w:vAlign w:val="center"/>
+          </w:tcPr>
+          <w:p>
+            <w:pPr>
+              <w:pStyle w:val="TableContents"/>
+              <w:widowControl w:val="false"/>
+              <w:suppressLineNumbers/>
+              <w:spacing w:before="0" w:after="200"/>
+              <w:rPr/>
+            </w:pPr>
+            <w:r>
+              <w:rPr/>
+              <w:t>400 series</w:t>
+            </w:r>
+            <w:r>
+              <w:rPr/>
+              <w:t xml:space="preserve"> still in progress</w:t>
             </w:r>
           </w:p>
         </w:tc>
@@ -1043,7 +1261,10 @@
         </w:rPr>
       </w:pPr>
       <w:r>
-        <w:rPr/>
+        <w:rPr>
+          <w:rFonts w:ascii="Courier New" w:hAnsi="Courier New"/>
+          <w:sz w:val="14"/>
+        </w:rPr>
       </w:r>
     </w:p>
     <w:p>
@@ -1073,7 +1294,23 @@
       </w:pPr>
       <w:r>
         <w:rPr/>
-        <w:t>The current fleet-level summary shows two dominant event classes: landing gear malfunctions and loss of control. Together, these account for 102 of the 191 events in the current dataset. CFIT, fuel starvation, and runway excursions form the next tier of recurring outcomes. This profile suggests that near-term safety work should not focus only on traditional engine-failure narratives; it should also address landing gear system management, approach/landing discipline, fuel management, and decision-making under workload.</w:t>
+        <w:t>The current fleet-level summary shows two dominant event classes: landing gear malfunctions and loss of control. Together, these account for 1</w:t>
+      </w:r>
+      <w:r>
+        <w:rPr/>
+        <w:t xml:space="preserve">23 </w:t>
+      </w:r>
+      <w:r>
+        <w:rPr/>
+        <w:t xml:space="preserve">of the </w:t>
+      </w:r>
+      <w:r>
+        <w:rPr/>
+        <w:t>227</w:t>
+      </w:r>
+      <w:r>
+        <w:rPr/>
+        <w:t xml:space="preserve"> events in the current dataset. CFIT, fuel starvation, and runway excursions form the next tier of recurring outcomes. This profile suggests that near-term safety work should not focus only on traditional engine-failure narratives; it should also address landing gear system management, approach/landing discipline, fuel management, and decision-making under workload.</w:t>
       </w:r>
     </w:p>
     <w:p>
@@ -1086,7 +1323,10 @@
         </w:rPr>
       </w:pPr>
       <w:r>
-        <w:rPr/>
+        <w:rPr>
+          <w:rFonts w:ascii="Courier New" w:hAnsi="Courier New"/>
+          <w:sz w:val="14"/>
+        </w:rPr>
       </w:r>
     </w:p>
     <w:tbl>
@@ -1210,7 +1450,15 @@
             </w:pPr>
             <w:r>
               <w:rPr/>
-              <w:t>29%</w:t>
+              <w:t>2</w:t>
+            </w:r>
+            <w:r>
+              <w:rPr/>
+              <w:t>7</w:t>
+            </w:r>
+            <w:r>
+              <w:rPr/>
+              <w:t>%</w:t>
             </w:r>
           </w:p>
         </w:tc>
@@ -1273,7 +1521,15 @@
             </w:pPr>
             <w:r>
               <w:rPr/>
-              <w:t>25%</w:t>
+              <w:t>2</w:t>
+            </w:r>
+            <w:r>
+              <w:rPr/>
+              <w:t>7</w:t>
+            </w:r>
+            <w:r>
+              <w:rPr/>
+              <w:t>%</w:t>
             </w:r>
           </w:p>
         </w:tc>
@@ -1336,7 +1592,11 @@
             </w:pPr>
             <w:r>
               <w:rPr/>
-              <w:t>9%</w:t>
+              <w:t>8</w:t>
+            </w:r>
+            <w:r>
+              <w:rPr/>
+              <w:t>%</w:t>
             </w:r>
           </w:p>
         </w:tc>
@@ -1624,7 +1884,10 @@
         </w:rPr>
       </w:pPr>
       <w:r>
-        <w:rPr/>
+        <w:rPr>
+          <w:rFonts w:ascii="Courier New" w:hAnsi="Courier New"/>
+          <w:sz w:val="14"/>
+        </w:rPr>
       </w:r>
     </w:p>
     <w:p>
@@ -1667,7 +1930,10 @@
         </w:rPr>
       </w:pPr>
       <w:r>
-        <w:rPr/>
+        <w:rPr>
+          <w:rFonts w:ascii="Courier New" w:hAnsi="Courier New"/>
+          <w:sz w:val="14"/>
+        </w:rPr>
       </w:r>
     </w:p>
     <w:tbl>
@@ -1685,8 +1951,8 @@
       </w:tblPr>
       <w:tblGrid>
         <w:gridCol w:w="3746"/>
-        <w:gridCol w:w="998"/>
-        <w:gridCol w:w="5954"/>
+        <w:gridCol w:w="997"/>
+        <w:gridCol w:w="5955"/>
       </w:tblGrid>
       <w:tr>
         <w:trPr>
@@ -1714,7 +1980,7 @@
         </w:tc>
         <w:tc>
           <w:tcPr>
-            <w:tcW w:w="998" w:type="dxa"/>
+            <w:tcW w:w="997" w:type="dxa"/>
             <w:tcBorders/>
             <w:vAlign w:val="center"/>
           </w:tcPr>
@@ -1734,7 +2000,7 @@
         </w:tc>
         <w:tc>
           <w:tcPr>
-            <w:tcW w:w="5954" w:type="dxa"/>
+            <w:tcW w:w="5955" w:type="dxa"/>
             <w:tcBorders/>
             <w:vAlign w:val="center"/>
           </w:tcPr>
@@ -1777,27 +2043,35 @@
         </w:tc>
         <w:tc>
           <w:tcPr>
-            <w:tcW w:w="998" w:type="dxa"/>
-            <w:tcBorders/>
-            <w:vAlign w:val="center"/>
-          </w:tcPr>
-          <w:p>
-            <w:pPr>
-              <w:pStyle w:val="TableContents"/>
-              <w:widowControl w:val="false"/>
-              <w:suppressLineNumbers/>
-              <w:spacing w:before="0" w:after="200"/>
-              <w:rPr/>
-            </w:pPr>
-            <w:r>
-              <w:rPr/>
-              <w:t>35%</w:t>
-            </w:r>
-          </w:p>
-        </w:tc>
-        <w:tc>
-          <w:tcPr>
-            <w:tcW w:w="5954" w:type="dxa"/>
+            <w:tcW w:w="997" w:type="dxa"/>
+            <w:tcBorders/>
+            <w:vAlign w:val="center"/>
+          </w:tcPr>
+          <w:p>
+            <w:pPr>
+              <w:pStyle w:val="TableContents"/>
+              <w:widowControl w:val="false"/>
+              <w:suppressLineNumbers/>
+              <w:spacing w:before="0" w:after="200"/>
+              <w:rPr/>
+            </w:pPr>
+            <w:r>
+              <w:rPr/>
+              <w:t>3</w:t>
+            </w:r>
+            <w:r>
+              <w:rPr/>
+              <w:t>2</w:t>
+            </w:r>
+            <w:r>
+              <w:rPr/>
+              <w:t>%</w:t>
+            </w:r>
+          </w:p>
+        </w:tc>
+        <w:tc>
+          <w:tcPr>
+            <w:tcW w:w="5955" w:type="dxa"/>
             <w:tcBorders/>
             <w:vAlign w:val="center"/>
           </w:tcPr>
@@ -1840,27 +2114,35 @@
         </w:tc>
         <w:tc>
           <w:tcPr>
-            <w:tcW w:w="998" w:type="dxa"/>
-            <w:tcBorders/>
-            <w:vAlign w:val="center"/>
-          </w:tcPr>
-          <w:p>
-            <w:pPr>
-              <w:pStyle w:val="TableContents"/>
-              <w:widowControl w:val="false"/>
-              <w:suppressLineNumbers/>
-              <w:spacing w:before="0" w:after="200"/>
-              <w:rPr/>
-            </w:pPr>
-            <w:r>
-              <w:rPr/>
-              <w:t>20%</w:t>
-            </w:r>
-          </w:p>
-        </w:tc>
-        <w:tc>
-          <w:tcPr>
-            <w:tcW w:w="5954" w:type="dxa"/>
+            <w:tcW w:w="997" w:type="dxa"/>
+            <w:tcBorders/>
+            <w:vAlign w:val="center"/>
+          </w:tcPr>
+          <w:p>
+            <w:pPr>
+              <w:pStyle w:val="TableContents"/>
+              <w:widowControl w:val="false"/>
+              <w:suppressLineNumbers/>
+              <w:spacing w:before="0" w:after="200"/>
+              <w:rPr/>
+            </w:pPr>
+            <w:r>
+              <w:rPr/>
+              <w:t>2</w:t>
+            </w:r>
+            <w:r>
+              <w:rPr/>
+              <w:t>1</w:t>
+            </w:r>
+            <w:r>
+              <w:rPr/>
+              <w:t>%</w:t>
+            </w:r>
+          </w:p>
+        </w:tc>
+        <w:tc>
+          <w:tcPr>
+            <w:tcW w:w="5955" w:type="dxa"/>
             <w:tcBorders/>
             <w:vAlign w:val="center"/>
           </w:tcPr>
@@ -1903,7 +2185,7 @@
         </w:tc>
         <w:tc>
           <w:tcPr>
-            <w:tcW w:w="998" w:type="dxa"/>
+            <w:tcW w:w="997" w:type="dxa"/>
             <w:tcBorders/>
             <w:vAlign w:val="center"/>
           </w:tcPr>
@@ -1923,7 +2205,7 @@
         </w:tc>
         <w:tc>
           <w:tcPr>
-            <w:tcW w:w="5954" w:type="dxa"/>
+            <w:tcW w:w="5955" w:type="dxa"/>
             <w:tcBorders/>
             <w:vAlign w:val="center"/>
           </w:tcPr>
@@ -1966,7 +2248,7 @@
         </w:tc>
         <w:tc>
           <w:tcPr>
-            <w:tcW w:w="998" w:type="dxa"/>
+            <w:tcW w:w="997" w:type="dxa"/>
             <w:tcBorders/>
             <w:vAlign w:val="center"/>
           </w:tcPr>
@@ -1986,7 +2268,7 @@
         </w:tc>
         <w:tc>
           <w:tcPr>
-            <w:tcW w:w="5954" w:type="dxa"/>
+            <w:tcW w:w="5955" w:type="dxa"/>
             <w:tcBorders/>
             <w:vAlign w:val="center"/>
           </w:tcPr>
@@ -2029,7 +2311,7 @@
         </w:tc>
         <w:tc>
           <w:tcPr>
-            <w:tcW w:w="998" w:type="dxa"/>
+            <w:tcW w:w="997" w:type="dxa"/>
             <w:tcBorders/>
             <w:vAlign w:val="center"/>
           </w:tcPr>
@@ -2049,7 +2331,7 @@
         </w:tc>
         <w:tc>
           <w:tcPr>
-            <w:tcW w:w="5954" w:type="dxa"/>
+            <w:tcW w:w="5955" w:type="dxa"/>
             <w:tcBorders/>
             <w:vAlign w:val="center"/>
           </w:tcPr>
@@ -2092,7 +2374,7 @@
         </w:tc>
         <w:tc>
           <w:tcPr>
-            <w:tcW w:w="998" w:type="dxa"/>
+            <w:tcW w:w="997" w:type="dxa"/>
             <w:tcBorders/>
             <w:vAlign w:val="center"/>
           </w:tcPr>
@@ -2112,7 +2394,7 @@
         </w:tc>
         <w:tc>
           <w:tcPr>
-            <w:tcW w:w="5954" w:type="dxa"/>
+            <w:tcW w:w="5955" w:type="dxa"/>
             <w:tcBorders/>
             <w:vAlign w:val="center"/>
           </w:tcPr>
@@ -2155,7 +2437,7 @@
         </w:tc>
         <w:tc>
           <w:tcPr>
-            <w:tcW w:w="998" w:type="dxa"/>
+            <w:tcW w:w="997" w:type="dxa"/>
             <w:tcBorders/>
             <w:vAlign w:val="center"/>
           </w:tcPr>
@@ -2175,7 +2457,7 @@
         </w:tc>
         <w:tc>
           <w:tcPr>
-            <w:tcW w:w="5954" w:type="dxa"/>
+            <w:tcW w:w="5955" w:type="dxa"/>
             <w:tcBorders/>
             <w:vAlign w:val="center"/>
           </w:tcPr>
@@ -2205,7 +2487,10 @@
         </w:rPr>
       </w:pPr>
       <w:r>
-        <w:rPr/>
+        <w:rPr>
+          <w:rFonts w:ascii="Courier New" w:hAnsi="Courier New"/>
+          <w:sz w:val="14"/>
+        </w:rPr>
       </w:r>
     </w:p>
     <w:p>
@@ -2218,7 +2503,10 @@
         </w:rPr>
       </w:pPr>
       <w:r>
-        <w:rPr/>
+        <w:rPr>
+          <w:rFonts w:ascii="Courier New" w:hAnsi="Courier New"/>
+          <w:sz w:val="14"/>
+        </w:rPr>
       </w:r>
     </w:p>
     <w:tbl>
@@ -2756,7 +3044,10 @@
         </w:rPr>
       </w:pPr>
       <w:r>
-        <w:rPr/>
+        <w:rPr>
+          <w:rFonts w:ascii="Courier New" w:hAnsi="Courier New"/>
+          <w:sz w:val="14"/>
+        </w:rPr>
       </w:r>
     </w:p>
     <w:p>
@@ -2790,7 +3081,10 @@
         </w:rPr>
       </w:pPr>
       <w:r>
-        <w:rPr/>
+        <w:rPr>
+          <w:rFonts w:ascii="Courier New" w:hAnsi="Courier New"/>
+          <w:sz w:val="14"/>
+        </w:rPr>
       </w:r>
     </w:p>
     <w:tbl>
@@ -2807,9 +3101,9 @@
         </w:tblCellMar>
       </w:tblPr>
       <w:tblGrid>
-        <w:gridCol w:w="1666"/>
+        <w:gridCol w:w="1665"/>
         <w:gridCol w:w="677"/>
-        <w:gridCol w:w="5391"/>
+        <w:gridCol w:w="5392"/>
       </w:tblGrid>
       <w:tr>
         <w:trPr>
@@ -2817,7 +3111,7 @@
         </w:trPr>
         <w:tc>
           <w:tcPr>
-            <w:tcW w:w="1666" w:type="dxa"/>
+            <w:tcW w:w="1665" w:type="dxa"/>
             <w:tcBorders/>
             <w:vAlign w:val="center"/>
           </w:tcPr>
@@ -2857,7 +3151,7 @@
         </w:tc>
         <w:tc>
           <w:tcPr>
-            <w:tcW w:w="5391" w:type="dxa"/>
+            <w:tcW w:w="5392" w:type="dxa"/>
             <w:tcBorders/>
             <w:vAlign w:val="center"/>
           </w:tcPr>
@@ -2880,7 +3174,7 @@
         <w:trPr/>
         <w:tc>
           <w:tcPr>
-            <w:tcW w:w="1666" w:type="dxa"/>
+            <w:tcW w:w="1665" w:type="dxa"/>
             <w:tcBorders/>
             <w:vAlign w:val="center"/>
           </w:tcPr>
@@ -2920,7 +3214,7 @@
         </w:tc>
         <w:tc>
           <w:tcPr>
-            <w:tcW w:w="5391" w:type="dxa"/>
+            <w:tcW w:w="5392" w:type="dxa"/>
             <w:tcBorders/>
             <w:vAlign w:val="center"/>
           </w:tcPr>
@@ -2943,7 +3237,7 @@
         <w:trPr/>
         <w:tc>
           <w:tcPr>
-            <w:tcW w:w="1666" w:type="dxa"/>
+            <w:tcW w:w="1665" w:type="dxa"/>
             <w:tcBorders/>
             <w:vAlign w:val="center"/>
           </w:tcPr>
@@ -2983,7 +3277,7 @@
         </w:tc>
         <w:tc>
           <w:tcPr>
-            <w:tcW w:w="5391" w:type="dxa"/>
+            <w:tcW w:w="5392" w:type="dxa"/>
             <w:tcBorders/>
             <w:vAlign w:val="center"/>
           </w:tcPr>
@@ -3013,7 +3307,10 @@
         </w:rPr>
       </w:pPr>
       <w:r>
-        <w:rPr/>
+        <w:rPr>
+          <w:rFonts w:ascii="Courier New" w:hAnsi="Courier New"/>
+          <w:sz w:val="14"/>
+        </w:rPr>
       </w:r>
     </w:p>
     <w:p>
@@ -3026,7 +3323,10 @@
         </w:rPr>
       </w:pPr>
       <w:r>
-        <w:rPr/>
+        <w:rPr>
+          <w:rFonts w:ascii="Courier New" w:hAnsi="Courier New"/>
+          <w:sz w:val="14"/>
+        </w:rPr>
       </w:r>
     </w:p>
     <w:tbl>
@@ -3044,9 +3344,9 @@
       </w:tblPr>
       <w:tblGrid>
         <w:gridCol w:w="739"/>
-        <w:gridCol w:w="811"/>
-        <w:gridCol w:w="925"/>
-        <w:gridCol w:w="3495"/>
+        <w:gridCol w:w="810"/>
+        <w:gridCol w:w="926"/>
+        <w:gridCol w:w="3494"/>
       </w:tblGrid>
       <w:tr>
         <w:trPr>
@@ -3074,7 +3374,7 @@
         </w:tc>
         <w:tc>
           <w:tcPr>
-            <w:tcW w:w="811" w:type="dxa"/>
+            <w:tcW w:w="810" w:type="dxa"/>
             <w:tcBorders/>
             <w:vAlign w:val="center"/>
           </w:tcPr>
@@ -3094,7 +3394,7 @@
         </w:tc>
         <w:tc>
           <w:tcPr>
-            <w:tcW w:w="925" w:type="dxa"/>
+            <w:tcW w:w="926" w:type="dxa"/>
             <w:tcBorders/>
             <w:vAlign w:val="center"/>
           </w:tcPr>
@@ -3114,7 +3414,7 @@
         </w:tc>
         <w:tc>
           <w:tcPr>
-            <w:tcW w:w="3495" w:type="dxa"/>
+            <w:tcW w:w="3494" w:type="dxa"/>
             <w:tcBorders/>
             <w:vAlign w:val="center"/>
           </w:tcPr>
@@ -3157,7 +3457,7 @@
         </w:tc>
         <w:tc>
           <w:tcPr>
-            <w:tcW w:w="811" w:type="dxa"/>
+            <w:tcW w:w="810" w:type="dxa"/>
             <w:tcBorders/>
             <w:vAlign w:val="center"/>
           </w:tcPr>
@@ -3177,7 +3477,7 @@
         </w:tc>
         <w:tc>
           <w:tcPr>
-            <w:tcW w:w="925" w:type="dxa"/>
+            <w:tcW w:w="926" w:type="dxa"/>
             <w:tcBorders/>
             <w:vAlign w:val="center"/>
           </w:tcPr>
@@ -3197,21 +3497,21 @@
         </w:tc>
         <w:tc>
           <w:tcPr>
-            <w:tcW w:w="3495" w:type="dxa"/>
-            <w:tcBorders/>
-            <w:vAlign w:val="center"/>
-          </w:tcPr>
-          <w:p>
-            <w:pPr>
-              <w:pStyle w:val="TableContents"/>
-              <w:widowControl w:val="false"/>
-              <w:suppressLineNumbers/>
-              <w:spacing w:before="0" w:after="200"/>
-              <w:rPr/>
-            </w:pPr>
-            <w:r>
-              <w:rPr/>
-              <w:t>Only complete dataset (2006–2026)</w:t>
+            <w:tcW w:w="3494" w:type="dxa"/>
+            <w:tcBorders/>
+            <w:vAlign w:val="center"/>
+          </w:tcPr>
+          <w:p>
+            <w:pPr>
+              <w:pStyle w:val="TableContents"/>
+              <w:widowControl w:val="false"/>
+              <w:suppressLineNumbers/>
+              <w:spacing w:before="0" w:after="200"/>
+              <w:rPr/>
+            </w:pPr>
+            <w:r>
+              <w:rPr/>
+              <w:t>complete dataset (2006–2026)</w:t>
             </w:r>
           </w:p>
         </w:tc>
@@ -3234,33 +3534,37 @@
             </w:pPr>
             <w:r>
               <w:rPr/>
-              <w:t>C340</w:t>
-            </w:r>
-          </w:p>
-        </w:tc>
-        <w:tc>
-          <w:tcPr>
-            <w:tcW w:w="811" w:type="dxa"/>
-            <w:tcBorders/>
-            <w:vAlign w:val="center"/>
-          </w:tcPr>
-          <w:p>
-            <w:pPr>
-              <w:pStyle w:val="TableContents"/>
-              <w:widowControl w:val="false"/>
-              <w:suppressLineNumbers/>
-              <w:spacing w:before="0" w:after="200"/>
-              <w:rPr/>
-            </w:pPr>
-            <w:r>
-              <w:rPr/>
-              <w:t>100%</w:t>
-            </w:r>
-          </w:p>
-        </w:tc>
-        <w:tc>
-          <w:tcPr>
-            <w:tcW w:w="925" w:type="dxa"/>
+              <w:t>C320</w:t>
+            </w:r>
+          </w:p>
+        </w:tc>
+        <w:tc>
+          <w:tcPr>
+            <w:tcW w:w="810" w:type="dxa"/>
+            <w:tcBorders/>
+            <w:vAlign w:val="center"/>
+          </w:tcPr>
+          <w:p>
+            <w:pPr>
+              <w:pStyle w:val="TableContents"/>
+              <w:widowControl w:val="false"/>
+              <w:suppressLineNumbers/>
+              <w:spacing w:before="0" w:after="200"/>
+              <w:rPr/>
+            </w:pPr>
+            <w:r>
+              <w:rPr/>
+              <w:t>100</w:t>
+            </w:r>
+            <w:r>
+              <w:rPr/>
+              <w:t>%</w:t>
+            </w:r>
+          </w:p>
+        </w:tc>
+        <w:tc>
+          <w:tcPr>
+            <w:tcW w:w="926" w:type="dxa"/>
             <w:tcBorders/>
             <w:vAlign w:val="center"/>
           </w:tcPr>
@@ -3280,21 +3584,21 @@
         </w:tc>
         <w:tc>
           <w:tcPr>
-            <w:tcW w:w="3495" w:type="dxa"/>
-            <w:tcBorders/>
-            <w:vAlign w:val="center"/>
-          </w:tcPr>
-          <w:p>
-            <w:pPr>
-              <w:pStyle w:val="TableContents"/>
-              <w:widowControl w:val="false"/>
-              <w:suppressLineNumbers/>
-              <w:spacing w:before="0" w:after="200"/>
-              <w:rPr/>
-            </w:pPr>
-            <w:r>
-              <w:rPr/>
-              <w:t>Current data is all Part 91</w:t>
+            <w:tcW w:w="3494" w:type="dxa"/>
+            <w:tcBorders/>
+            <w:vAlign w:val="center"/>
+          </w:tcPr>
+          <w:p>
+            <w:pPr>
+              <w:pStyle w:val="TableContents"/>
+              <w:widowControl w:val="false"/>
+              <w:suppressLineNumbers/>
+              <w:spacing w:before="0" w:after="200"/>
+              <w:rPr/>
+            </w:pPr>
+            <w:r>
+              <w:rPr/>
+              <w:t>Complete dataset (2006-2026</w:t>
             </w:r>
           </w:p>
         </w:tc>
@@ -3317,13 +3621,96 @@
             </w:pPr>
             <w:r>
               <w:rPr/>
+              <w:t>C340</w:t>
+            </w:r>
+          </w:p>
+        </w:tc>
+        <w:tc>
+          <w:tcPr>
+            <w:tcW w:w="810" w:type="dxa"/>
+            <w:tcBorders/>
+            <w:vAlign w:val="center"/>
+          </w:tcPr>
+          <w:p>
+            <w:pPr>
+              <w:pStyle w:val="TableContents"/>
+              <w:widowControl w:val="false"/>
+              <w:suppressLineNumbers/>
+              <w:spacing w:before="0" w:after="200"/>
+              <w:rPr/>
+            </w:pPr>
+            <w:r>
+              <w:rPr/>
+              <w:t>100%</w:t>
+            </w:r>
+          </w:p>
+        </w:tc>
+        <w:tc>
+          <w:tcPr>
+            <w:tcW w:w="926" w:type="dxa"/>
+            <w:tcBorders/>
+            <w:vAlign w:val="center"/>
+          </w:tcPr>
+          <w:p>
+            <w:pPr>
+              <w:pStyle w:val="TableContents"/>
+              <w:widowControl w:val="false"/>
+              <w:suppressLineNumbers/>
+              <w:spacing w:before="0" w:after="200"/>
+              <w:rPr/>
+            </w:pPr>
+            <w:r>
+              <w:rPr/>
+              <w:t>0%</w:t>
+            </w:r>
+          </w:p>
+        </w:tc>
+        <w:tc>
+          <w:tcPr>
+            <w:tcW w:w="3494" w:type="dxa"/>
+            <w:tcBorders/>
+            <w:vAlign w:val="center"/>
+          </w:tcPr>
+          <w:p>
+            <w:pPr>
+              <w:pStyle w:val="TableContents"/>
+              <w:widowControl w:val="false"/>
+              <w:suppressLineNumbers/>
+              <w:spacing w:before="0" w:after="200"/>
+              <w:rPr/>
+            </w:pPr>
+            <w:r>
+              <w:rPr/>
+              <w:t>Complete dataset (2006-2026</w:t>
+            </w:r>
+          </w:p>
+        </w:tc>
+      </w:tr>
+      <w:tr>
+        <w:trPr/>
+        <w:tc>
+          <w:tcPr>
+            <w:tcW w:w="739" w:type="dxa"/>
+            <w:tcBorders/>
+            <w:vAlign w:val="center"/>
+          </w:tcPr>
+          <w:p>
+            <w:pPr>
+              <w:pStyle w:val="TableContents"/>
+              <w:widowControl w:val="false"/>
+              <w:suppressLineNumbers/>
+              <w:spacing w:before="0" w:after="200"/>
+              <w:rPr/>
+            </w:pPr>
+            <w:r>
+              <w:rPr/>
               <w:t>C402</w:t>
             </w:r>
           </w:p>
         </w:tc>
         <w:tc>
           <w:tcPr>
-            <w:tcW w:w="811" w:type="dxa"/>
+            <w:tcW w:w="810" w:type="dxa"/>
             <w:tcBorders/>
             <w:vAlign w:val="center"/>
           </w:tcPr>
@@ -3343,7 +3730,7 @@
         </w:tc>
         <w:tc>
           <w:tcPr>
-            <w:tcW w:w="925" w:type="dxa"/>
+            <w:tcW w:w="926" w:type="dxa"/>
             <w:tcBorders/>
             <w:vAlign w:val="center"/>
           </w:tcPr>
@@ -3363,7 +3750,7 @@
         </w:tc>
         <w:tc>
           <w:tcPr>
-            <w:tcW w:w="3495" w:type="dxa"/>
+            <w:tcW w:w="3494" w:type="dxa"/>
             <w:tcBorders/>
             <w:vAlign w:val="center"/>
           </w:tcPr>
@@ -3408,7 +3795,7 @@
         </w:tc>
         <w:tc>
           <w:tcPr>
-            <w:tcW w:w="811" w:type="dxa"/>
+            <w:tcW w:w="810" w:type="dxa"/>
             <w:tcBorders/>
             <w:vAlign w:val="center"/>
           </w:tcPr>
@@ -3430,7 +3817,7 @@
         </w:tc>
         <w:tc>
           <w:tcPr>
-            <w:tcW w:w="925" w:type="dxa"/>
+            <w:tcW w:w="926" w:type="dxa"/>
             <w:tcBorders/>
             <w:vAlign w:val="center"/>
           </w:tcPr>
@@ -3452,7 +3839,7 @@
         </w:tc>
         <w:tc>
           <w:tcPr>
-            <w:tcW w:w="3495" w:type="dxa"/>
+            <w:tcW w:w="3494" w:type="dxa"/>
             <w:tcBorders/>
             <w:vAlign w:val="center"/>
           </w:tcPr>
@@ -3482,7 +3869,10 @@
         </w:rPr>
       </w:pPr>
       <w:r>
-        <w:rPr/>
+        <w:rPr>
+          <w:rFonts w:ascii="Courier New" w:hAnsi="Courier New"/>
+          <w:sz w:val="14"/>
+        </w:rPr>
       </w:r>
     </w:p>
     <w:p>
@@ -3512,7 +3902,39 @@
       </w:pPr>
       <w:r>
         <w:rPr/>
-        <w:t>Severity is separated from frequency in this analysis. The fleet contains 66 fatal events and 125 non-fatal events in the current 191-event dataset. C340 has the highest fatal share within its current small slice, while C402 has a low fatal share but a strong concentration of landing and landing gear events. This reinforces the need to discuss severity and frequency separately: a frequent pattern may not be the most lethal, and a lethal pattern may not be the most common.</w:t>
+        <w:t xml:space="preserve">Severity is separated from frequency in this analysis. The fleet contains </w:t>
+      </w:r>
+      <w:r>
+        <w:rPr/>
+        <w:t>81</w:t>
+      </w:r>
+      <w:r>
+        <w:rPr/>
+        <w:t xml:space="preserve"> fatal events and 1</w:t>
+      </w:r>
+      <w:r>
+        <w:rPr/>
+        <w:t>46</w:t>
+      </w:r>
+      <w:r>
+        <w:rPr/>
+        <w:t xml:space="preserve"> non-fatal events in the current </w:t>
+      </w:r>
+      <w:r>
+        <w:rPr/>
+        <w:t>227</w:t>
+      </w:r>
+      <w:r>
+        <w:rPr/>
+        <w:t>-event dataset. C3</w:t>
+      </w:r>
+      <w:r>
+        <w:rPr/>
+        <w:t>2</w:t>
+      </w:r>
+      <w:r>
+        <w:rPr/>
+        <w:t>0 has the highest fatal share within its current small slice, while C402 has a low fatal share but a strong concentration of landing and landing gear events. This reinforces the need to discuss severity and frequency separately: a frequent pattern may not be the most lethal, and a lethal pattern may not be the most common.</w:t>
       </w:r>
     </w:p>
     <w:p>
@@ -3525,7 +3947,10 @@
         </w:rPr>
       </w:pPr>
       <w:r>
-        <w:rPr/>
+        <w:rPr>
+          <w:rFonts w:ascii="Courier New" w:hAnsi="Courier New"/>
+          <w:sz w:val="14"/>
+        </w:rPr>
       </w:r>
     </w:p>
     <w:tbl>
@@ -3542,9 +3967,9 @@
         </w:tblCellMar>
       </w:tblPr>
       <w:tblGrid>
-        <w:gridCol w:w="739"/>
+        <w:gridCol w:w="738"/>
         <w:gridCol w:w="837"/>
-        <w:gridCol w:w="4833"/>
+        <w:gridCol w:w="4834"/>
       </w:tblGrid>
       <w:tr>
         <w:trPr>
@@ -3552,7 +3977,7 @@
         </w:trPr>
         <w:tc>
           <w:tcPr>
-            <w:tcW w:w="739" w:type="dxa"/>
+            <w:tcW w:w="738" w:type="dxa"/>
             <w:tcBorders/>
             <w:vAlign w:val="center"/>
           </w:tcPr>
@@ -3592,7 +4017,7 @@
         </w:tc>
         <w:tc>
           <w:tcPr>
-            <w:tcW w:w="4833" w:type="dxa"/>
+            <w:tcW w:w="4834" w:type="dxa"/>
             <w:tcBorders/>
             <w:vAlign w:val="center"/>
           </w:tcPr>
@@ -3615,7 +4040,7 @@
         <w:trPr/>
         <w:tc>
           <w:tcPr>
-            <w:tcW w:w="739" w:type="dxa"/>
+            <w:tcW w:w="738" w:type="dxa"/>
             <w:tcBorders/>
             <w:vAlign w:val="center"/>
           </w:tcPr>
@@ -3655,21 +4080,21 @@
         </w:tc>
         <w:tc>
           <w:tcPr>
-            <w:tcW w:w="4833" w:type="dxa"/>
-            <w:tcBorders/>
-            <w:vAlign w:val="center"/>
-          </w:tcPr>
-          <w:p>
-            <w:pPr>
-              <w:pStyle w:val="TableContents"/>
-              <w:widowControl w:val="false"/>
-              <w:suppressLineNumbers/>
-              <w:spacing w:before="0" w:after="200"/>
-              <w:rPr/>
-            </w:pPr>
-            <w:r>
-              <w:rPr/>
-              <w:t>Largest and only complete dataset</w:t>
+            <w:tcW w:w="4834" w:type="dxa"/>
+            <w:tcBorders/>
+            <w:vAlign w:val="center"/>
+          </w:tcPr>
+          <w:p>
+            <w:pPr>
+              <w:pStyle w:val="TableContents"/>
+              <w:widowControl w:val="false"/>
+              <w:suppressLineNumbers/>
+              <w:spacing w:before="0" w:after="200"/>
+              <w:rPr/>
+            </w:pPr>
+            <w:r>
+              <w:rPr/>
+              <w:t>complete dataset</w:t>
             </w:r>
           </w:p>
         </w:tc>
@@ -3678,21 +4103,21 @@
         <w:trPr/>
         <w:tc>
           <w:tcPr>
-            <w:tcW w:w="739" w:type="dxa"/>
-            <w:tcBorders/>
-            <w:vAlign w:val="center"/>
-          </w:tcPr>
-          <w:p>
-            <w:pPr>
-              <w:pStyle w:val="TableContents"/>
-              <w:widowControl w:val="false"/>
-              <w:suppressLineNumbers/>
-              <w:spacing w:before="0" w:after="200"/>
-              <w:rPr/>
-            </w:pPr>
-            <w:r>
-              <w:rPr/>
-              <w:t>C340</w:t>
+            <w:tcW w:w="738" w:type="dxa"/>
+            <w:tcBorders/>
+            <w:vAlign w:val="center"/>
+          </w:tcPr>
+          <w:p>
+            <w:pPr>
+              <w:pStyle w:val="TableContents"/>
+              <w:widowControl w:val="false"/>
+              <w:suppressLineNumbers/>
+              <w:spacing w:before="0" w:after="200"/>
+              <w:rPr/>
+            </w:pPr>
+            <w:r>
+              <w:rPr/>
+              <w:t>C320</w:t>
             </w:r>
           </w:p>
         </w:tc>
@@ -3712,27 +4137,27 @@
             </w:pPr>
             <w:r>
               <w:rPr/>
-              <w:t>52%</w:t>
-            </w:r>
-          </w:p>
-        </w:tc>
-        <w:tc>
-          <w:tcPr>
-            <w:tcW w:w="4833" w:type="dxa"/>
-            <w:tcBorders/>
-            <w:vAlign w:val="center"/>
-          </w:tcPr>
-          <w:p>
-            <w:pPr>
-              <w:pStyle w:val="TableContents"/>
-              <w:widowControl w:val="false"/>
-              <w:suppressLineNumbers/>
-              <w:spacing w:before="0" w:after="200"/>
-              <w:rPr/>
-            </w:pPr>
-            <w:r>
-              <w:rPr/>
-              <w:t>Small sample; higher apparent severity</w:t>
+              <w:t>60%</w:t>
+            </w:r>
+          </w:p>
+        </w:tc>
+        <w:tc>
+          <w:tcPr>
+            <w:tcW w:w="4834" w:type="dxa"/>
+            <w:tcBorders/>
+            <w:vAlign w:val="center"/>
+          </w:tcPr>
+          <w:p>
+            <w:pPr>
+              <w:pStyle w:val="TableContents"/>
+              <w:widowControl w:val="false"/>
+              <w:suppressLineNumbers/>
+              <w:spacing w:before="0" w:after="200"/>
+              <w:rPr/>
+            </w:pPr>
+            <w:r>
+              <w:rPr/>
+              <w:t>Complete dataset, very small sample size</w:t>
             </w:r>
           </w:p>
         </w:tc>
@@ -3741,21 +4166,21 @@
         <w:trPr/>
         <w:tc>
           <w:tcPr>
-            <w:tcW w:w="739" w:type="dxa"/>
-            <w:tcBorders/>
-            <w:vAlign w:val="center"/>
-          </w:tcPr>
-          <w:p>
-            <w:pPr>
-              <w:pStyle w:val="TableContents"/>
-              <w:widowControl w:val="false"/>
-              <w:suppressLineNumbers/>
-              <w:spacing w:before="0" w:after="200"/>
-              <w:rPr/>
-            </w:pPr>
-            <w:r>
-              <w:rPr/>
-              <w:t>C402</w:t>
+            <w:tcW w:w="738" w:type="dxa"/>
+            <w:tcBorders/>
+            <w:vAlign w:val="center"/>
+          </w:tcPr>
+          <w:p>
+            <w:pPr>
+              <w:pStyle w:val="TableContents"/>
+              <w:widowControl w:val="false"/>
+              <w:suppressLineNumbers/>
+              <w:spacing w:before="0" w:after="200"/>
+              <w:rPr/>
+            </w:pPr>
+            <w:r>
+              <w:rPr/>
+              <w:t>C340</w:t>
             </w:r>
           </w:p>
         </w:tc>
@@ -3775,27 +4200,31 @@
             </w:pPr>
             <w:r>
               <w:rPr/>
-              <w:t>7%</w:t>
-            </w:r>
-          </w:p>
-        </w:tc>
-        <w:tc>
-          <w:tcPr>
-            <w:tcW w:w="4833" w:type="dxa"/>
-            <w:tcBorders/>
-            <w:vAlign w:val="center"/>
-          </w:tcPr>
-          <w:p>
-            <w:pPr>
-              <w:pStyle w:val="TableContents"/>
-              <w:widowControl w:val="false"/>
-              <w:suppressLineNumbers/>
-              <w:spacing w:before="0" w:after="200"/>
-              <w:rPr/>
-            </w:pPr>
-            <w:r>
-              <w:rPr/>
-              <w:t>Lower severity; gear/operational events dominate</w:t>
+              <w:t>42</w:t>
+            </w:r>
+            <w:r>
+              <w:rPr/>
+              <w:t>%</w:t>
+            </w:r>
+          </w:p>
+        </w:tc>
+        <w:tc>
+          <w:tcPr>
+            <w:tcW w:w="4834" w:type="dxa"/>
+            <w:tcBorders/>
+            <w:vAlign w:val="center"/>
+          </w:tcPr>
+          <w:p>
+            <w:pPr>
+              <w:pStyle w:val="TableContents"/>
+              <w:widowControl w:val="false"/>
+              <w:suppressLineNumbers/>
+              <w:spacing w:before="0" w:after="200"/>
+              <w:rPr/>
+            </w:pPr>
+            <w:r>
+              <w:rPr/>
+              <w:t>Small sample; higher apparent severity</w:t>
             </w:r>
           </w:p>
         </w:tc>
@@ -3804,7 +4233,70 @@
         <w:trPr/>
         <w:tc>
           <w:tcPr>
-            <w:tcW w:w="739" w:type="dxa"/>
+            <w:tcW w:w="738" w:type="dxa"/>
+            <w:tcBorders/>
+            <w:vAlign w:val="center"/>
+          </w:tcPr>
+          <w:p>
+            <w:pPr>
+              <w:pStyle w:val="TableContents"/>
+              <w:widowControl w:val="false"/>
+              <w:suppressLineNumbers/>
+              <w:spacing w:before="0" w:after="200"/>
+              <w:rPr/>
+            </w:pPr>
+            <w:r>
+              <w:rPr/>
+              <w:t>C402</w:t>
+            </w:r>
+          </w:p>
+        </w:tc>
+        <w:tc>
+          <w:tcPr>
+            <w:tcW w:w="837" w:type="dxa"/>
+            <w:tcBorders/>
+            <w:vAlign w:val="center"/>
+          </w:tcPr>
+          <w:p>
+            <w:pPr>
+              <w:pStyle w:val="TableContents"/>
+              <w:widowControl w:val="false"/>
+              <w:suppressLineNumbers/>
+              <w:spacing w:before="0" w:after="200"/>
+              <w:rPr/>
+            </w:pPr>
+            <w:r>
+              <w:rPr/>
+              <w:t>7%</w:t>
+            </w:r>
+          </w:p>
+        </w:tc>
+        <w:tc>
+          <w:tcPr>
+            <w:tcW w:w="4834" w:type="dxa"/>
+            <w:tcBorders/>
+            <w:vAlign w:val="center"/>
+          </w:tcPr>
+          <w:p>
+            <w:pPr>
+              <w:pStyle w:val="TableContents"/>
+              <w:widowControl w:val="false"/>
+              <w:suppressLineNumbers/>
+              <w:spacing w:before="0" w:after="200"/>
+              <w:rPr/>
+            </w:pPr>
+            <w:r>
+              <w:rPr/>
+              <w:t>Lower severity; gear/operational events dominate</w:t>
+            </w:r>
+          </w:p>
+        </w:tc>
+      </w:tr>
+      <w:tr>
+        <w:trPr/>
+        <w:tc>
+          <w:tcPr>
+            <w:tcW w:w="738" w:type="dxa"/>
             <w:tcBorders/>
             <w:vAlign w:val="center"/>
           </w:tcPr>
@@ -3848,7 +4340,7 @@
         </w:tc>
         <w:tc>
           <w:tcPr>
-            <w:tcW w:w="4833" w:type="dxa"/>
+            <w:tcW w:w="4834" w:type="dxa"/>
             <w:tcBorders/>
             <w:vAlign w:val="center"/>
           </w:tcPr>
@@ -3878,7 +4370,10 @@
         </w:rPr>
       </w:pPr>
       <w:r>
-        <w:rPr/>
+        <w:rPr>
+          <w:rFonts w:ascii="Courier New" w:hAnsi="Courier New"/>
+          <w:sz w:val="14"/>
+        </w:rPr>
       </w:r>
     </w:p>
     <w:p>
@@ -3912,7 +4407,10 @@
         </w:rPr>
       </w:pPr>
       <w:r>
-        <w:rPr/>
+        <w:rPr>
+          <w:rFonts w:ascii="Courier New" w:hAnsi="Courier New"/>
+          <w:sz w:val="14"/>
+        </w:rPr>
       </w:r>
     </w:p>
     <w:tbl>
@@ -3929,9 +4427,9 @@
         </w:tblCellMar>
       </w:tblPr>
       <w:tblGrid>
-        <w:gridCol w:w="2804"/>
-        <w:gridCol w:w="7843"/>
-        <w:gridCol w:w="1605"/>
+        <w:gridCol w:w="2250"/>
+        <w:gridCol w:w="2730"/>
+        <w:gridCol w:w="7271"/>
         <w:gridCol w:w="6160"/>
       </w:tblGrid>
       <w:tr>
@@ -3940,7 +4438,7 @@
         </w:trPr>
         <w:tc>
           <w:tcPr>
-            <w:tcW w:w="2804" w:type="dxa"/>
+            <w:tcW w:w="2250" w:type="dxa"/>
             <w:tcBorders/>
             <w:vAlign w:val="center"/>
           </w:tcPr>
@@ -3960,7 +4458,7 @@
         </w:tc>
         <w:tc>
           <w:tcPr>
-            <w:tcW w:w="7843" w:type="dxa"/>
+            <w:tcW w:w="2730" w:type="dxa"/>
             <w:tcBorders/>
             <w:vAlign w:val="center"/>
           </w:tcPr>
@@ -3980,7 +4478,7 @@
         </w:tc>
         <w:tc>
           <w:tcPr>
-            <w:tcW w:w="1605" w:type="dxa"/>
+            <w:tcW w:w="7271" w:type="dxa"/>
             <w:tcBorders/>
             <w:vAlign w:val="center"/>
           </w:tcPr>
@@ -4023,7 +4521,7 @@
         <w:trPr/>
         <w:tc>
           <w:tcPr>
-            <w:tcW w:w="2804" w:type="dxa"/>
+            <w:tcW w:w="2250" w:type="dxa"/>
             <w:tcBorders/>
             <w:vAlign w:val="center"/>
           </w:tcPr>
@@ -4045,7 +4543,7 @@
         </w:tc>
         <w:tc>
           <w:tcPr>
-            <w:tcW w:w="7843" w:type="dxa"/>
+            <w:tcW w:w="2730" w:type="dxa"/>
             <w:tcBorders/>
             <w:vAlign w:val="center"/>
           </w:tcPr>
@@ -4065,7 +4563,7 @@
         </w:tc>
         <w:tc>
           <w:tcPr>
-            <w:tcW w:w="1605" w:type="dxa"/>
+            <w:tcW w:w="7271" w:type="dxa"/>
             <w:tcBorders/>
             <w:vAlign w:val="center"/>
           </w:tcPr>
@@ -4108,7 +4606,7 @@
         <w:trPr/>
         <w:tc>
           <w:tcPr>
-            <w:tcW w:w="2804" w:type="dxa"/>
+            <w:tcW w:w="2250" w:type="dxa"/>
             <w:tcBorders/>
             <w:vAlign w:val="center"/>
           </w:tcPr>
@@ -4130,7 +4628,7 @@
         </w:tc>
         <w:tc>
           <w:tcPr>
-            <w:tcW w:w="7843" w:type="dxa"/>
+            <w:tcW w:w="2730" w:type="dxa"/>
             <w:tcBorders/>
             <w:vAlign w:val="center"/>
           </w:tcPr>
@@ -4150,7 +4648,7 @@
         </w:tc>
         <w:tc>
           <w:tcPr>
-            <w:tcW w:w="1605" w:type="dxa"/>
+            <w:tcW w:w="7271" w:type="dxa"/>
             <w:tcBorders/>
             <w:vAlign w:val="center"/>
           </w:tcPr>
@@ -4193,7 +4691,7 @@
         <w:trPr/>
         <w:tc>
           <w:tcPr>
-            <w:tcW w:w="2804" w:type="dxa"/>
+            <w:tcW w:w="2250" w:type="dxa"/>
             <w:tcBorders/>
             <w:vAlign w:val="center"/>
           </w:tcPr>
@@ -4215,7 +4713,7 @@
         </w:tc>
         <w:tc>
           <w:tcPr>
-            <w:tcW w:w="7843" w:type="dxa"/>
+            <w:tcW w:w="2730" w:type="dxa"/>
             <w:tcBorders/>
             <w:vAlign w:val="center"/>
           </w:tcPr>
@@ -4235,7 +4733,7 @@
         </w:tc>
         <w:tc>
           <w:tcPr>
-            <w:tcW w:w="1605" w:type="dxa"/>
+            <w:tcW w:w="7271" w:type="dxa"/>
             <w:tcBorders/>
             <w:vAlign w:val="center"/>
           </w:tcPr>
@@ -4278,7 +4776,7 @@
         <w:trPr/>
         <w:tc>
           <w:tcPr>
-            <w:tcW w:w="2804" w:type="dxa"/>
+            <w:tcW w:w="2250" w:type="dxa"/>
             <w:tcBorders/>
             <w:vAlign w:val="center"/>
           </w:tcPr>
@@ -4300,7 +4798,7 @@
         </w:tc>
         <w:tc>
           <w:tcPr>
-            <w:tcW w:w="7843" w:type="dxa"/>
+            <w:tcW w:w="2730" w:type="dxa"/>
             <w:tcBorders/>
             <w:vAlign w:val="center"/>
           </w:tcPr>
@@ -4320,7 +4818,7 @@
         </w:tc>
         <w:tc>
           <w:tcPr>
-            <w:tcW w:w="1605" w:type="dxa"/>
+            <w:tcW w:w="7271" w:type="dxa"/>
             <w:tcBorders/>
             <w:vAlign w:val="center"/>
           </w:tcPr>
@@ -4370,7 +4868,10 @@
         </w:rPr>
       </w:pPr>
       <w:r>
-        <w:rPr/>
+        <w:rPr>
+          <w:rFonts w:ascii="Courier New" w:hAnsi="Courier New"/>
+          <w:sz w:val="14"/>
+        </w:rPr>
       </w:r>
     </w:p>
     <w:p>
@@ -4414,7 +4915,10 @@
         </w:rPr>
       </w:pPr>
       <w:r>
-        <w:rPr/>
+        <w:rPr>
+          <w:rFonts w:ascii="Courier New" w:hAnsi="Courier New"/>
+          <w:sz w:val="14"/>
+        </w:rPr>
       </w:r>
     </w:p>
     <w:tbl>
@@ -4431,7 +4935,7 @@
         </w:tblCellMar>
       </w:tblPr>
       <w:tblGrid>
-        <w:gridCol w:w="2804"/>
+        <w:gridCol w:w="2803"/>
         <w:gridCol w:w="6384"/>
         <w:gridCol w:w="1605"/>
         <w:gridCol w:w="6525"/>
@@ -4442,7 +4946,7 @@
         </w:trPr>
         <w:tc>
           <w:tcPr>
-            <w:tcW w:w="2804" w:type="dxa"/>
+            <w:tcW w:w="2803" w:type="dxa"/>
             <w:tcBorders/>
             <w:vAlign w:val="center"/>
           </w:tcPr>
@@ -4525,7 +5029,7 @@
         <w:trPr/>
         <w:tc>
           <w:tcPr>
-            <w:tcW w:w="2804" w:type="dxa"/>
+            <w:tcW w:w="2803" w:type="dxa"/>
             <w:tcBorders/>
             <w:vAlign w:val="center"/>
           </w:tcPr>
@@ -4610,7 +5114,7 @@
         <w:trPr/>
         <w:tc>
           <w:tcPr>
-            <w:tcW w:w="2804" w:type="dxa"/>
+            <w:tcW w:w="2803" w:type="dxa"/>
             <w:tcBorders/>
             <w:vAlign w:val="center"/>
           </w:tcPr>
@@ -4695,7 +5199,7 @@
         <w:trPr/>
         <w:tc>
           <w:tcPr>
-            <w:tcW w:w="2804" w:type="dxa"/>
+            <w:tcW w:w="2803" w:type="dxa"/>
             <w:tcBorders/>
             <w:vAlign w:val="center"/>
           </w:tcPr>
@@ -4780,7 +5284,7 @@
         <w:trPr/>
         <w:tc>
           <w:tcPr>
-            <w:tcW w:w="2804" w:type="dxa"/>
+            <w:tcW w:w="2803" w:type="dxa"/>
             <w:tcBorders/>
             <w:vAlign w:val="center"/>
           </w:tcPr>
@@ -4872,7 +5376,10 @@
         </w:rPr>
       </w:pPr>
       <w:r>
-        <w:rPr/>
+        <w:rPr>
+          <w:rFonts w:ascii="Courier New" w:hAnsi="Courier New"/>
+          <w:sz w:val="14"/>
+        </w:rPr>
       </w:r>
     </w:p>
     <w:p>
@@ -4906,7 +5413,10 @@
         </w:rPr>
       </w:pPr>
       <w:r>
-        <w:rPr/>
+        <w:rPr>
+          <w:rFonts w:ascii="Courier New" w:hAnsi="Courier New"/>
+          <w:sz w:val="14"/>
+        </w:rPr>
       </w:r>
     </w:p>
     <w:tbl>
@@ -4925,7 +5435,7 @@
       <w:tblGrid>
         <w:gridCol w:w="2804"/>
         <w:gridCol w:w="6331"/>
-        <w:gridCol w:w="1719"/>
+        <w:gridCol w:w="1718"/>
         <w:gridCol w:w="6301"/>
       </w:tblGrid>
       <w:tr>
@@ -4974,7 +5484,7 @@
         </w:tc>
         <w:tc>
           <w:tcPr>
-            <w:tcW w:w="1719" w:type="dxa"/>
+            <w:tcW w:w="1718" w:type="dxa"/>
             <w:tcBorders/>
             <w:vAlign w:val="center"/>
           </w:tcPr>
@@ -5059,7 +5569,7 @@
         </w:tc>
         <w:tc>
           <w:tcPr>
-            <w:tcW w:w="1719" w:type="dxa"/>
+            <w:tcW w:w="1718" w:type="dxa"/>
             <w:tcBorders/>
             <w:vAlign w:val="center"/>
           </w:tcPr>
@@ -5144,7 +5654,7 @@
         </w:tc>
         <w:tc>
           <w:tcPr>
-            <w:tcW w:w="1719" w:type="dxa"/>
+            <w:tcW w:w="1718" w:type="dxa"/>
             <w:tcBorders/>
             <w:vAlign w:val="center"/>
           </w:tcPr>
@@ -5229,7 +5739,7 @@
         </w:tc>
         <w:tc>
           <w:tcPr>
-            <w:tcW w:w="1719" w:type="dxa"/>
+            <w:tcW w:w="1718" w:type="dxa"/>
             <w:tcBorders/>
             <w:vAlign w:val="center"/>
           </w:tcPr>
@@ -5314,7 +5824,7 @@
         </w:tc>
         <w:tc>
           <w:tcPr>
-            <w:tcW w:w="1719" w:type="dxa"/>
+            <w:tcW w:w="1718" w:type="dxa"/>
             <w:tcBorders/>
             <w:vAlign w:val="center"/>
           </w:tcPr>
@@ -5364,7 +5874,10 @@
         </w:rPr>
       </w:pPr>
       <w:r>
-        <w:rPr/>
+        <w:rPr>
+          <w:rFonts w:ascii="Courier New" w:hAnsi="Courier New"/>
+          <w:sz w:val="14"/>
+        </w:rPr>
       </w:r>
     </w:p>
     <w:p>
@@ -5398,7 +5911,10 @@
         </w:rPr>
       </w:pPr>
       <w:r>
-        <w:rPr/>
+        <w:rPr>
+          <w:rFonts w:ascii="Courier New" w:hAnsi="Courier New"/>
+          <w:sz w:val="14"/>
+        </w:rPr>
       </w:r>
     </w:p>
     <w:tbl>
@@ -5417,7 +5933,7 @@
       <w:tblGrid>
         <w:gridCol w:w="2804"/>
         <w:gridCol w:w="6506"/>
-        <w:gridCol w:w="1719"/>
+        <w:gridCol w:w="1718"/>
         <w:gridCol w:w="5896"/>
       </w:tblGrid>
       <w:tr>
@@ -5466,7 +5982,7 @@
         </w:tc>
         <w:tc>
           <w:tcPr>
-            <w:tcW w:w="1719" w:type="dxa"/>
+            <w:tcW w:w="1718" w:type="dxa"/>
             <w:tcBorders/>
             <w:vAlign w:val="center"/>
           </w:tcPr>
@@ -5551,7 +6067,7 @@
         </w:tc>
         <w:tc>
           <w:tcPr>
-            <w:tcW w:w="1719" w:type="dxa"/>
+            <w:tcW w:w="1718" w:type="dxa"/>
             <w:tcBorders/>
             <w:vAlign w:val="center"/>
           </w:tcPr>
@@ -5636,7 +6152,7 @@
         </w:tc>
         <w:tc>
           <w:tcPr>
-            <w:tcW w:w="1719" w:type="dxa"/>
+            <w:tcW w:w="1718" w:type="dxa"/>
             <w:tcBorders/>
             <w:vAlign w:val="center"/>
           </w:tcPr>
@@ -5721,7 +6237,7 @@
         </w:tc>
         <w:tc>
           <w:tcPr>
-            <w:tcW w:w="1719" w:type="dxa"/>
+            <w:tcW w:w="1718" w:type="dxa"/>
             <w:tcBorders/>
             <w:vAlign w:val="center"/>
           </w:tcPr>
@@ -5806,7 +6322,7 @@
         </w:tc>
         <w:tc>
           <w:tcPr>
-            <w:tcW w:w="1719" w:type="dxa"/>
+            <w:tcW w:w="1718" w:type="dxa"/>
             <w:tcBorders/>
             <w:vAlign w:val="center"/>
           </w:tcPr>
@@ -5856,7 +6372,10 @@
         </w:rPr>
       </w:pPr>
       <w:r>
-        <w:rPr/>
+        <w:rPr>
+          <w:rFonts w:ascii="Courier New" w:hAnsi="Courier New"/>
+          <w:sz w:val="14"/>
+        </w:rPr>
       </w:r>
     </w:p>
     <w:p>
@@ -5900,7 +6419,10 @@
         </w:rPr>
       </w:pPr>
       <w:r>
-        <w:rPr/>
+        <w:rPr>
+          <w:rFonts w:ascii="Courier New" w:hAnsi="Courier New"/>
+          <w:sz w:val="14"/>
+        </w:rPr>
       </w:r>
     </w:p>
     <w:tbl>
@@ -6257,7 +6779,10 @@
         </w:rPr>
       </w:pPr>
       <w:r>
-        <w:rPr/>
+        <w:rPr>
+          <w:rFonts w:ascii="Courier New" w:hAnsi="Courier New"/>
+          <w:sz w:val="14"/>
+        </w:rPr>
       </w:r>
     </w:p>
     <w:p>
@@ -6276,11 +6801,7 @@
       </w:pPr>
       <w:r>
         <w:rPr/>
-        <w:t xml:space="preserve">C340: Top Phase × Factor Patterns </w:t>
-      </w:r>
-      <w:r>
-        <w:rPr/>
-        <w:t>(counts to be added later)</w:t>
+        <w:t>C340: Top Phase × Factor Patterns (counts to be added later)</w:t>
       </w:r>
     </w:p>
     <w:p>
@@ -6293,7 +6814,10 @@
         </w:rPr>
       </w:pPr>
       <w:r>
-        <w:rPr/>
+        <w:rPr>
+          <w:rFonts w:ascii="Courier New" w:hAnsi="Courier New"/>
+          <w:sz w:val="14"/>
+        </w:rPr>
       </w:r>
     </w:p>
     <w:tbl>
@@ -6310,9 +6834,9 @@
         </w:tblCellMar>
       </w:tblPr>
       <w:tblGrid>
-        <w:gridCol w:w="1345"/>
+        <w:gridCol w:w="1344"/>
         <w:gridCol w:w="6141"/>
-        <w:gridCol w:w="7197"/>
+        <w:gridCol w:w="7198"/>
       </w:tblGrid>
       <w:tr>
         <w:trPr>
@@ -6320,7 +6844,7 @@
         </w:trPr>
         <w:tc>
           <w:tcPr>
-            <w:tcW w:w="1345" w:type="dxa"/>
+            <w:tcW w:w="1344" w:type="dxa"/>
             <w:tcBorders/>
             <w:vAlign w:val="center"/>
           </w:tcPr>
@@ -6360,7 +6884,7 @@
         </w:tc>
         <w:tc>
           <w:tcPr>
-            <w:tcW w:w="7197" w:type="dxa"/>
+            <w:tcW w:w="7198" w:type="dxa"/>
             <w:tcBorders/>
             <w:vAlign w:val="center"/>
           </w:tcPr>
@@ -6383,7 +6907,7 @@
         <w:trPr/>
         <w:tc>
           <w:tcPr>
-            <w:tcW w:w="1345" w:type="dxa"/>
+            <w:tcW w:w="1344" w:type="dxa"/>
             <w:tcBorders/>
             <w:vAlign w:val="center"/>
           </w:tcPr>
@@ -6425,7 +6949,7 @@
         </w:tc>
         <w:tc>
           <w:tcPr>
-            <w:tcW w:w="7197" w:type="dxa"/>
+            <w:tcW w:w="7198" w:type="dxa"/>
             <w:tcBorders/>
             <w:vAlign w:val="center"/>
           </w:tcPr>
@@ -6448,7 +6972,7 @@
         <w:trPr/>
         <w:tc>
           <w:tcPr>
-            <w:tcW w:w="1345" w:type="dxa"/>
+            <w:tcW w:w="1344" w:type="dxa"/>
             <w:tcBorders/>
             <w:vAlign w:val="center"/>
           </w:tcPr>
@@ -6490,7 +7014,7 @@
         </w:tc>
         <w:tc>
           <w:tcPr>
-            <w:tcW w:w="7197" w:type="dxa"/>
+            <w:tcW w:w="7198" w:type="dxa"/>
             <w:tcBorders/>
             <w:vAlign w:val="center"/>
           </w:tcPr>
@@ -6513,7 +7037,7 @@
         <w:trPr/>
         <w:tc>
           <w:tcPr>
-            <w:tcW w:w="1345" w:type="dxa"/>
+            <w:tcW w:w="1344" w:type="dxa"/>
             <w:tcBorders/>
             <w:vAlign w:val="center"/>
           </w:tcPr>
@@ -6555,7 +7079,7 @@
         </w:tc>
         <w:tc>
           <w:tcPr>
-            <w:tcW w:w="7197" w:type="dxa"/>
+            <w:tcW w:w="7198" w:type="dxa"/>
             <w:tcBorders/>
             <w:vAlign w:val="center"/>
           </w:tcPr>
@@ -6578,7 +7102,7 @@
         <w:trPr/>
         <w:tc>
           <w:tcPr>
-            <w:tcW w:w="1345" w:type="dxa"/>
+            <w:tcW w:w="1344" w:type="dxa"/>
             <w:tcBorders/>
             <w:vAlign w:val="center"/>
           </w:tcPr>
@@ -6620,7 +7144,7 @@
         </w:tc>
         <w:tc>
           <w:tcPr>
-            <w:tcW w:w="7197" w:type="dxa"/>
+            <w:tcW w:w="7198" w:type="dxa"/>
             <w:tcBorders/>
             <w:vAlign w:val="center"/>
           </w:tcPr>
@@ -6643,7 +7167,7 @@
         <w:trPr/>
         <w:tc>
           <w:tcPr>
-            <w:tcW w:w="1345" w:type="dxa"/>
+            <w:tcW w:w="1344" w:type="dxa"/>
             <w:tcBorders/>
             <w:vAlign w:val="center"/>
           </w:tcPr>
@@ -6685,7 +7209,7 @@
         </w:tc>
         <w:tc>
           <w:tcPr>
-            <w:tcW w:w="7197" w:type="dxa"/>
+            <w:tcW w:w="7198" w:type="dxa"/>
             <w:tcBorders/>
             <w:vAlign w:val="center"/>
           </w:tcPr>
@@ -6715,7 +7239,10 @@
         </w:rPr>
       </w:pPr>
       <w:r>
-        <w:rPr/>
+        <w:rPr>
+          <w:rFonts w:ascii="Courier New" w:hAnsi="Courier New"/>
+          <w:sz w:val="14"/>
+        </w:rPr>
       </w:r>
     </w:p>
     <w:p>
@@ -6725,11 +7252,7 @@
       </w:pPr>
       <w:r>
         <w:rPr/>
-        <w:t xml:space="preserve">C402: Top Phase × Factor Patterns </w:t>
-      </w:r>
-      <w:r>
-        <w:rPr/>
-        <w:t>(counts to be added later)</w:t>
+        <w:t>C402: Top Phase × Factor Patterns (counts to be added later)</w:t>
       </w:r>
     </w:p>
     <w:p>
@@ -6742,7 +7265,10 @@
         </w:rPr>
       </w:pPr>
       <w:r>
-        <w:rPr/>
+        <w:rPr>
+          <w:rFonts w:ascii="Courier New" w:hAnsi="Courier New"/>
+          <w:sz w:val="14"/>
+        </w:rPr>
       </w:r>
     </w:p>
     <w:tbl>
@@ -6760,8 +7286,8 @@
       </w:tblPr>
       <w:tblGrid>
         <w:gridCol w:w="1082"/>
-        <w:gridCol w:w="7016"/>
-        <w:gridCol w:w="7143"/>
+        <w:gridCol w:w="7015"/>
+        <w:gridCol w:w="7144"/>
       </w:tblGrid>
       <w:tr>
         <w:trPr>
@@ -6789,7 +7315,7 @@
         </w:tc>
         <w:tc>
           <w:tcPr>
-            <w:tcW w:w="7016" w:type="dxa"/>
+            <w:tcW w:w="7015" w:type="dxa"/>
             <w:tcBorders/>
             <w:vAlign w:val="center"/>
           </w:tcPr>
@@ -6809,7 +7335,7 @@
         </w:tc>
         <w:tc>
           <w:tcPr>
-            <w:tcW w:w="7143" w:type="dxa"/>
+            <w:tcW w:w="7144" w:type="dxa"/>
             <w:tcBorders/>
             <w:vAlign w:val="center"/>
           </w:tcPr>
@@ -6854,7 +7380,7 @@
         </w:tc>
         <w:tc>
           <w:tcPr>
-            <w:tcW w:w="7016" w:type="dxa"/>
+            <w:tcW w:w="7015" w:type="dxa"/>
             <w:tcBorders/>
             <w:vAlign w:val="center"/>
           </w:tcPr>
@@ -6874,7 +7400,7 @@
         </w:tc>
         <w:tc>
           <w:tcPr>
-            <w:tcW w:w="7143" w:type="dxa"/>
+            <w:tcW w:w="7144" w:type="dxa"/>
             <w:tcBorders/>
             <w:vAlign w:val="center"/>
           </w:tcPr>
@@ -6919,7 +7445,7 @@
         </w:tc>
         <w:tc>
           <w:tcPr>
-            <w:tcW w:w="7016" w:type="dxa"/>
+            <w:tcW w:w="7015" w:type="dxa"/>
             <w:tcBorders/>
             <w:vAlign w:val="center"/>
           </w:tcPr>
@@ -6939,7 +7465,7 @@
         </w:tc>
         <w:tc>
           <w:tcPr>
-            <w:tcW w:w="7143" w:type="dxa"/>
+            <w:tcW w:w="7144" w:type="dxa"/>
             <w:tcBorders/>
             <w:vAlign w:val="center"/>
           </w:tcPr>
@@ -6984,7 +7510,7 @@
         </w:tc>
         <w:tc>
           <w:tcPr>
-            <w:tcW w:w="7016" w:type="dxa"/>
+            <w:tcW w:w="7015" w:type="dxa"/>
             <w:tcBorders/>
             <w:vAlign w:val="center"/>
           </w:tcPr>
@@ -7004,7 +7530,7 @@
         </w:tc>
         <w:tc>
           <w:tcPr>
-            <w:tcW w:w="7143" w:type="dxa"/>
+            <w:tcW w:w="7144" w:type="dxa"/>
             <w:tcBorders/>
             <w:vAlign w:val="center"/>
           </w:tcPr>
@@ -7049,7 +7575,7 @@
         </w:tc>
         <w:tc>
           <w:tcPr>
-            <w:tcW w:w="7016" w:type="dxa"/>
+            <w:tcW w:w="7015" w:type="dxa"/>
             <w:tcBorders/>
             <w:vAlign w:val="center"/>
           </w:tcPr>
@@ -7069,7 +7595,7 @@
         </w:tc>
         <w:tc>
           <w:tcPr>
-            <w:tcW w:w="7143" w:type="dxa"/>
+            <w:tcW w:w="7144" w:type="dxa"/>
             <w:tcBorders/>
             <w:vAlign w:val="center"/>
           </w:tcPr>
@@ -7099,7 +7625,10 @@
         </w:rPr>
       </w:pPr>
       <w:r>
-        <w:rPr/>
+        <w:rPr>
+          <w:rFonts w:ascii="Courier New" w:hAnsi="Courier New"/>
+          <w:sz w:val="14"/>
+        </w:rPr>
       </w:r>
     </w:p>
     <w:p>
@@ -7142,7 +7671,10 @@
         </w:rPr>
       </w:pPr>
       <w:r>
-        <w:rPr/>
+        <w:rPr>
+          <w:rFonts w:ascii="Courier New" w:hAnsi="Courier New"/>
+          <w:sz w:val="14"/>
+        </w:rPr>
       </w:r>
     </w:p>
     <w:tbl>
@@ -7629,7 +8161,10 @@
         </w:rPr>
       </w:pPr>
       <w:r>
-        <w:rPr/>
+        <w:rPr>
+          <w:rFonts w:ascii="Courier New" w:hAnsi="Courier New"/>
+          <w:sz w:val="14"/>
+        </w:rPr>
       </w:r>
     </w:p>
     <w:p>
@@ -7663,7 +8198,10 @@
         </w:rPr>
       </w:pPr>
       <w:r>
-        <w:rPr/>
+        <w:rPr>
+          <w:rFonts w:ascii="Courier New" w:hAnsi="Courier New"/>
+          <w:sz w:val="14"/>
+        </w:rPr>
       </w:r>
     </w:p>
     <w:tbl>
@@ -7680,10 +8218,10 @@
         </w:tblCellMar>
       </w:tblPr>
       <w:tblGrid>
-        <w:gridCol w:w="1140"/>
+        <w:gridCol w:w="1139"/>
         <w:gridCol w:w="7165"/>
-        <w:gridCol w:w="1719"/>
-        <w:gridCol w:w="6592"/>
+        <w:gridCol w:w="1720"/>
+        <w:gridCol w:w="6591"/>
       </w:tblGrid>
       <w:tr>
         <w:trPr>
@@ -7691,7 +8229,7 @@
         </w:trPr>
         <w:tc>
           <w:tcPr>
-            <w:tcW w:w="1140" w:type="dxa"/>
+            <w:tcW w:w="1139" w:type="dxa"/>
             <w:tcBorders/>
             <w:vAlign w:val="center"/>
           </w:tcPr>
@@ -7731,7 +8269,7 @@
         </w:tc>
         <w:tc>
           <w:tcPr>
-            <w:tcW w:w="1719" w:type="dxa"/>
+            <w:tcW w:w="1720" w:type="dxa"/>
             <w:tcBorders/>
             <w:vAlign w:val="center"/>
           </w:tcPr>
@@ -7751,7 +8289,7 @@
         </w:tc>
         <w:tc>
           <w:tcPr>
-            <w:tcW w:w="6592" w:type="dxa"/>
+            <w:tcW w:w="6591" w:type="dxa"/>
             <w:tcBorders/>
             <w:vAlign w:val="center"/>
           </w:tcPr>
@@ -7774,7 +8312,7 @@
         <w:trPr/>
         <w:tc>
           <w:tcPr>
-            <w:tcW w:w="1140" w:type="dxa"/>
+            <w:tcW w:w="1139" w:type="dxa"/>
             <w:tcBorders/>
             <w:vAlign w:val="center"/>
           </w:tcPr>
@@ -7816,7 +8354,7 @@
         </w:tc>
         <w:tc>
           <w:tcPr>
-            <w:tcW w:w="1719" w:type="dxa"/>
+            <w:tcW w:w="1720" w:type="dxa"/>
             <w:tcBorders/>
             <w:vAlign w:val="center"/>
           </w:tcPr>
@@ -7836,7 +8374,7 @@
         </w:tc>
         <w:tc>
           <w:tcPr>
-            <w:tcW w:w="6592" w:type="dxa"/>
+            <w:tcW w:w="6591" w:type="dxa"/>
             <w:tcBorders/>
             <w:vAlign w:val="center"/>
           </w:tcPr>
@@ -7859,7 +8397,7 @@
         <w:trPr/>
         <w:tc>
           <w:tcPr>
-            <w:tcW w:w="1140" w:type="dxa"/>
+            <w:tcW w:w="1139" w:type="dxa"/>
             <w:tcBorders/>
             <w:vAlign w:val="center"/>
           </w:tcPr>
@@ -7901,7 +8439,7 @@
         </w:tc>
         <w:tc>
           <w:tcPr>
-            <w:tcW w:w="1719" w:type="dxa"/>
+            <w:tcW w:w="1720" w:type="dxa"/>
             <w:tcBorders/>
             <w:vAlign w:val="center"/>
           </w:tcPr>
@@ -7921,7 +8459,7 @@
         </w:tc>
         <w:tc>
           <w:tcPr>
-            <w:tcW w:w="6592" w:type="dxa"/>
+            <w:tcW w:w="6591" w:type="dxa"/>
             <w:tcBorders/>
             <w:vAlign w:val="center"/>
           </w:tcPr>
@@ -7951,7 +8489,10 @@
         </w:rPr>
       </w:pPr>
       <w:r>
-        <w:rPr/>
+        <w:rPr>
+          <w:rFonts w:ascii="Courier New" w:hAnsi="Courier New"/>
+          <w:sz w:val="14"/>
+        </w:rPr>
       </w:r>
     </w:p>
     <w:p>
@@ -7994,7 +8535,10 @@
         </w:rPr>
       </w:pPr>
       <w:r>
-        <w:rPr/>
+        <w:rPr>
+          <w:rFonts w:ascii="Courier New" w:hAnsi="Courier New"/>
+          <w:sz w:val="14"/>
+        </w:rPr>
       </w:r>
     </w:p>
     <w:tbl>
@@ -8011,10 +8555,10 @@
         </w:tblCellMar>
       </w:tblPr>
       <w:tblGrid>
-        <w:gridCol w:w="739"/>
-        <w:gridCol w:w="2743"/>
+        <w:gridCol w:w="738"/>
+        <w:gridCol w:w="2744"/>
         <w:gridCol w:w="3223"/>
-        <w:gridCol w:w="5863"/>
+        <w:gridCol w:w="5862"/>
       </w:tblGrid>
       <w:tr>
         <w:trPr>
@@ -8022,7 +8566,7 @@
         </w:trPr>
         <w:tc>
           <w:tcPr>
-            <w:tcW w:w="739" w:type="dxa"/>
+            <w:tcW w:w="738" w:type="dxa"/>
             <w:tcBorders/>
             <w:vAlign w:val="center"/>
           </w:tcPr>
@@ -8042,7 +8586,7 @@
         </w:tc>
         <w:tc>
           <w:tcPr>
-            <w:tcW w:w="2743" w:type="dxa"/>
+            <w:tcW w:w="2744" w:type="dxa"/>
             <w:tcBorders/>
             <w:vAlign w:val="center"/>
           </w:tcPr>
@@ -8082,7 +8626,7 @@
         </w:tc>
         <w:tc>
           <w:tcPr>
-            <w:tcW w:w="5863" w:type="dxa"/>
+            <w:tcW w:w="5862" w:type="dxa"/>
             <w:tcBorders/>
             <w:vAlign w:val="center"/>
           </w:tcPr>
@@ -8105,7 +8649,7 @@
         <w:trPr/>
         <w:tc>
           <w:tcPr>
-            <w:tcW w:w="739" w:type="dxa"/>
+            <w:tcW w:w="738" w:type="dxa"/>
             <w:tcBorders/>
             <w:vAlign w:val="center"/>
           </w:tcPr>
@@ -8125,7 +8669,7 @@
         </w:tc>
         <w:tc>
           <w:tcPr>
-            <w:tcW w:w="2743" w:type="dxa"/>
+            <w:tcW w:w="2744" w:type="dxa"/>
             <w:tcBorders/>
             <w:vAlign w:val="center"/>
           </w:tcPr>
@@ -8165,7 +8709,7 @@
         </w:tc>
         <w:tc>
           <w:tcPr>
-            <w:tcW w:w="5863" w:type="dxa"/>
+            <w:tcW w:w="5862" w:type="dxa"/>
             <w:tcBorders/>
             <w:vAlign w:val="center"/>
           </w:tcPr>
@@ -8188,7 +8732,7 @@
         <w:trPr/>
         <w:tc>
           <w:tcPr>
-            <w:tcW w:w="739" w:type="dxa"/>
+            <w:tcW w:w="738" w:type="dxa"/>
             <w:tcBorders/>
             <w:vAlign w:val="center"/>
           </w:tcPr>
@@ -8208,7 +8752,7 @@
         </w:tc>
         <w:tc>
           <w:tcPr>
-            <w:tcW w:w="2743" w:type="dxa"/>
+            <w:tcW w:w="2744" w:type="dxa"/>
             <w:tcBorders/>
             <w:vAlign w:val="center"/>
           </w:tcPr>
@@ -8248,7 +8792,7 @@
         </w:tc>
         <w:tc>
           <w:tcPr>
-            <w:tcW w:w="5863" w:type="dxa"/>
+            <w:tcW w:w="5862" w:type="dxa"/>
             <w:tcBorders/>
             <w:vAlign w:val="center"/>
           </w:tcPr>
@@ -8271,7 +8815,7 @@
         <w:trPr/>
         <w:tc>
           <w:tcPr>
-            <w:tcW w:w="739" w:type="dxa"/>
+            <w:tcW w:w="738" w:type="dxa"/>
             <w:tcBorders/>
             <w:vAlign w:val="center"/>
           </w:tcPr>
@@ -8291,7 +8835,7 @@
         </w:tc>
         <w:tc>
           <w:tcPr>
-            <w:tcW w:w="2743" w:type="dxa"/>
+            <w:tcW w:w="2744" w:type="dxa"/>
             <w:tcBorders/>
             <w:vAlign w:val="center"/>
           </w:tcPr>
@@ -8331,7 +8875,7 @@
         </w:tc>
         <w:tc>
           <w:tcPr>
-            <w:tcW w:w="5863" w:type="dxa"/>
+            <w:tcW w:w="5862" w:type="dxa"/>
             <w:tcBorders/>
             <w:vAlign w:val="center"/>
           </w:tcPr>
@@ -8354,7 +8898,7 @@
         <w:trPr/>
         <w:tc>
           <w:tcPr>
-            <w:tcW w:w="739" w:type="dxa"/>
+            <w:tcW w:w="738" w:type="dxa"/>
             <w:tcBorders/>
             <w:vAlign w:val="center"/>
           </w:tcPr>
@@ -8374,7 +8918,7 @@
         </w:tc>
         <w:tc>
           <w:tcPr>
-            <w:tcW w:w="2743" w:type="dxa"/>
+            <w:tcW w:w="2744" w:type="dxa"/>
             <w:tcBorders/>
             <w:vAlign w:val="center"/>
           </w:tcPr>
@@ -8414,7 +8958,7 @@
         </w:tc>
         <w:tc>
           <w:tcPr>
-            <w:tcW w:w="5863" w:type="dxa"/>
+            <w:tcW w:w="5862" w:type="dxa"/>
             <w:tcBorders/>
             <w:vAlign w:val="center"/>
           </w:tcPr>
@@ -8437,7 +8981,7 @@
         <w:trPr/>
         <w:tc>
           <w:tcPr>
-            <w:tcW w:w="739" w:type="dxa"/>
+            <w:tcW w:w="738" w:type="dxa"/>
             <w:tcBorders/>
             <w:vAlign w:val="center"/>
           </w:tcPr>
@@ -8457,7 +9001,7 @@
         </w:tc>
         <w:tc>
           <w:tcPr>
-            <w:tcW w:w="2743" w:type="dxa"/>
+            <w:tcW w:w="2744" w:type="dxa"/>
             <w:tcBorders/>
             <w:vAlign w:val="center"/>
           </w:tcPr>
@@ -8497,7 +9041,7 @@
         </w:tc>
         <w:tc>
           <w:tcPr>
-            <w:tcW w:w="5863" w:type="dxa"/>
+            <w:tcW w:w="5862" w:type="dxa"/>
             <w:tcBorders/>
             <w:vAlign w:val="center"/>
           </w:tcPr>
@@ -8520,7 +9064,7 @@
         <w:trPr/>
         <w:tc>
           <w:tcPr>
-            <w:tcW w:w="739" w:type="dxa"/>
+            <w:tcW w:w="738" w:type="dxa"/>
             <w:tcBorders/>
             <w:vAlign w:val="center"/>
           </w:tcPr>
@@ -8540,7 +9084,7 @@
         </w:tc>
         <w:tc>
           <w:tcPr>
-            <w:tcW w:w="2743" w:type="dxa"/>
+            <w:tcW w:w="2744" w:type="dxa"/>
             <w:tcBorders/>
             <w:vAlign w:val="center"/>
           </w:tcPr>
@@ -8580,7 +9124,7 @@
         </w:tc>
         <w:tc>
           <w:tcPr>
-            <w:tcW w:w="5863" w:type="dxa"/>
+            <w:tcW w:w="5862" w:type="dxa"/>
             <w:tcBorders/>
             <w:vAlign w:val="center"/>
           </w:tcPr>
@@ -8603,7 +9147,7 @@
         <w:trPr/>
         <w:tc>
           <w:tcPr>
-            <w:tcW w:w="739" w:type="dxa"/>
+            <w:tcW w:w="738" w:type="dxa"/>
             <w:tcBorders/>
             <w:vAlign w:val="center"/>
           </w:tcPr>
@@ -8623,7 +9167,7 @@
         </w:tc>
         <w:tc>
           <w:tcPr>
-            <w:tcW w:w="2743" w:type="dxa"/>
+            <w:tcW w:w="2744" w:type="dxa"/>
             <w:tcBorders/>
             <w:vAlign w:val="center"/>
           </w:tcPr>
@@ -8663,7 +9207,7 @@
         </w:tc>
         <w:tc>
           <w:tcPr>
-            <w:tcW w:w="5863" w:type="dxa"/>
+            <w:tcW w:w="5862" w:type="dxa"/>
             <w:tcBorders/>
             <w:vAlign w:val="center"/>
           </w:tcPr>
@@ -8686,7 +9230,7 @@
         <w:trPr/>
         <w:tc>
           <w:tcPr>
-            <w:tcW w:w="739" w:type="dxa"/>
+            <w:tcW w:w="738" w:type="dxa"/>
             <w:tcBorders/>
             <w:vAlign w:val="center"/>
           </w:tcPr>
@@ -8706,7 +9250,7 @@
         </w:tc>
         <w:tc>
           <w:tcPr>
-            <w:tcW w:w="2743" w:type="dxa"/>
+            <w:tcW w:w="2744" w:type="dxa"/>
             <w:tcBorders/>
             <w:vAlign w:val="center"/>
           </w:tcPr>
@@ -8746,7 +9290,7 @@
         </w:tc>
         <w:tc>
           <w:tcPr>
-            <w:tcW w:w="5863" w:type="dxa"/>
+            <w:tcW w:w="5862" w:type="dxa"/>
             <w:tcBorders/>
             <w:vAlign w:val="center"/>
           </w:tcPr>
@@ -8776,7 +9320,10 @@
         </w:rPr>
       </w:pPr>
       <w:r>
-        <w:rPr/>
+        <w:rPr>
+          <w:rFonts w:ascii="Courier New" w:hAnsi="Courier New"/>
+          <w:sz w:val="14"/>
+        </w:rPr>
       </w:r>
     </w:p>
     <w:p>
@@ -9081,7 +9628,10 @@
         </w:rPr>
       </w:pPr>
       <w:r>
-        <w:rPr/>
+        <w:rPr>
+          <w:rFonts w:ascii="Courier New" w:hAnsi="Courier New"/>
+          <w:sz w:val="14"/>
+        </w:rPr>
       </w:r>
     </w:p>
     <w:tbl>
@@ -9098,10 +9648,10 @@
         </w:tblCellMar>
       </w:tblPr>
       <w:tblGrid>
-        <w:gridCol w:w="629"/>
-        <w:gridCol w:w="5063"/>
-        <w:gridCol w:w="8974"/>
-        <w:gridCol w:w="11825"/>
+        <w:gridCol w:w="627"/>
+        <w:gridCol w:w="5065"/>
+        <w:gridCol w:w="8973"/>
+        <w:gridCol w:w="11824"/>
       </w:tblGrid>
       <w:tr>
         <w:trPr>
@@ -9109,7 +9659,7 @@
         </w:trPr>
         <w:tc>
           <w:tcPr>
-            <w:tcW w:w="629" w:type="dxa"/>
+            <w:tcW w:w="627" w:type="dxa"/>
             <w:tcBorders/>
             <w:vAlign w:val="center"/>
           </w:tcPr>
@@ -9129,7 +9679,7 @@
         </w:tc>
         <w:tc>
           <w:tcPr>
-            <w:tcW w:w="5063" w:type="dxa"/>
+            <w:tcW w:w="5065" w:type="dxa"/>
             <w:tcBorders/>
             <w:vAlign w:val="center"/>
           </w:tcPr>
@@ -9149,7 +9699,7 @@
         </w:tc>
         <w:tc>
           <w:tcPr>
-            <w:tcW w:w="8974" w:type="dxa"/>
+            <w:tcW w:w="8973" w:type="dxa"/>
             <w:tcBorders/>
             <w:vAlign w:val="center"/>
           </w:tcPr>
@@ -9169,7 +9719,7 @@
         </w:tc>
         <w:tc>
           <w:tcPr>
-            <w:tcW w:w="11825" w:type="dxa"/>
+            <w:tcW w:w="11824" w:type="dxa"/>
             <w:tcBorders/>
             <w:vAlign w:val="center"/>
           </w:tcPr>
@@ -9192,7 +9742,7 @@
         <w:trPr/>
         <w:tc>
           <w:tcPr>
-            <w:tcW w:w="629" w:type="dxa"/>
+            <w:tcW w:w="627" w:type="dxa"/>
             <w:tcBorders/>
             <w:vAlign w:val="center"/>
           </w:tcPr>
@@ -9212,7 +9762,7 @@
         </w:tc>
         <w:tc>
           <w:tcPr>
-            <w:tcW w:w="5063" w:type="dxa"/>
+            <w:tcW w:w="5065" w:type="dxa"/>
             <w:tcBorders/>
             <w:vAlign w:val="center"/>
           </w:tcPr>
@@ -9234,7 +9784,7 @@
         </w:tc>
         <w:tc>
           <w:tcPr>
-            <w:tcW w:w="8974" w:type="dxa"/>
+            <w:tcW w:w="8973" w:type="dxa"/>
             <w:tcBorders/>
             <w:vAlign w:val="center"/>
           </w:tcPr>
@@ -9254,7 +9804,7 @@
         </w:tc>
         <w:tc>
           <w:tcPr>
-            <w:tcW w:w="11825" w:type="dxa"/>
+            <w:tcW w:w="11824" w:type="dxa"/>
             <w:tcBorders/>
             <w:vAlign w:val="center"/>
           </w:tcPr>
@@ -9277,7 +9827,7 @@
         <w:trPr/>
         <w:tc>
           <w:tcPr>
-            <w:tcW w:w="629" w:type="dxa"/>
+            <w:tcW w:w="627" w:type="dxa"/>
             <w:tcBorders/>
             <w:vAlign w:val="center"/>
           </w:tcPr>
@@ -9297,7 +9847,7 @@
         </w:tc>
         <w:tc>
           <w:tcPr>
-            <w:tcW w:w="5063" w:type="dxa"/>
+            <w:tcW w:w="5065" w:type="dxa"/>
             <w:tcBorders/>
             <w:vAlign w:val="center"/>
           </w:tcPr>
@@ -9319,7 +9869,7 @@
         </w:tc>
         <w:tc>
           <w:tcPr>
-            <w:tcW w:w="8974" w:type="dxa"/>
+            <w:tcW w:w="8973" w:type="dxa"/>
             <w:tcBorders/>
             <w:vAlign w:val="center"/>
           </w:tcPr>
@@ -9339,7 +9889,7 @@
         </w:tc>
         <w:tc>
           <w:tcPr>
-            <w:tcW w:w="11825" w:type="dxa"/>
+            <w:tcW w:w="11824" w:type="dxa"/>
             <w:tcBorders/>
             <w:vAlign w:val="center"/>
           </w:tcPr>
@@ -9362,7 +9912,7 @@
         <w:trPr/>
         <w:tc>
           <w:tcPr>
-            <w:tcW w:w="629" w:type="dxa"/>
+            <w:tcW w:w="627" w:type="dxa"/>
             <w:tcBorders/>
             <w:vAlign w:val="center"/>
           </w:tcPr>
@@ -9382,7 +9932,7 @@
         </w:tc>
         <w:tc>
           <w:tcPr>
-            <w:tcW w:w="5063" w:type="dxa"/>
+            <w:tcW w:w="5065" w:type="dxa"/>
             <w:tcBorders/>
             <w:vAlign w:val="center"/>
           </w:tcPr>
@@ -9404,7 +9954,7 @@
         </w:tc>
         <w:tc>
           <w:tcPr>
-            <w:tcW w:w="8974" w:type="dxa"/>
+            <w:tcW w:w="8973" w:type="dxa"/>
             <w:tcBorders/>
             <w:vAlign w:val="center"/>
           </w:tcPr>
@@ -9424,7 +9974,7 @@
         </w:tc>
         <w:tc>
           <w:tcPr>
-            <w:tcW w:w="11825" w:type="dxa"/>
+            <w:tcW w:w="11824" w:type="dxa"/>
             <w:tcBorders/>
             <w:vAlign w:val="center"/>
           </w:tcPr>
@@ -9447,7 +9997,7 @@
         <w:trPr/>
         <w:tc>
           <w:tcPr>
-            <w:tcW w:w="629" w:type="dxa"/>
+            <w:tcW w:w="627" w:type="dxa"/>
             <w:tcBorders/>
             <w:vAlign w:val="center"/>
           </w:tcPr>
@@ -9467,7 +10017,7 @@
         </w:tc>
         <w:tc>
           <w:tcPr>
-            <w:tcW w:w="5063" w:type="dxa"/>
+            <w:tcW w:w="5065" w:type="dxa"/>
             <w:tcBorders/>
             <w:vAlign w:val="center"/>
           </w:tcPr>
@@ -9489,7 +10039,7 @@
         </w:tc>
         <w:tc>
           <w:tcPr>
-            <w:tcW w:w="8974" w:type="dxa"/>
+            <w:tcW w:w="8973" w:type="dxa"/>
             <w:tcBorders/>
             <w:vAlign w:val="center"/>
           </w:tcPr>
@@ -9509,7 +10059,7 @@
         </w:tc>
         <w:tc>
           <w:tcPr>
-            <w:tcW w:w="11825" w:type="dxa"/>
+            <w:tcW w:w="11824" w:type="dxa"/>
             <w:tcBorders/>
             <w:vAlign w:val="center"/>
           </w:tcPr>
@@ -9532,7 +10082,7 @@
         <w:trPr/>
         <w:tc>
           <w:tcPr>
-            <w:tcW w:w="629" w:type="dxa"/>
+            <w:tcW w:w="627" w:type="dxa"/>
             <w:tcBorders/>
             <w:vAlign w:val="center"/>
           </w:tcPr>
@@ -9552,7 +10102,7 @@
         </w:tc>
         <w:tc>
           <w:tcPr>
-            <w:tcW w:w="5063" w:type="dxa"/>
+            <w:tcW w:w="5065" w:type="dxa"/>
             <w:tcBorders/>
             <w:vAlign w:val="center"/>
           </w:tcPr>
@@ -9574,7 +10124,7 @@
         </w:tc>
         <w:tc>
           <w:tcPr>
-            <w:tcW w:w="8974" w:type="dxa"/>
+            <w:tcW w:w="8973" w:type="dxa"/>
             <w:tcBorders/>
             <w:vAlign w:val="center"/>
           </w:tcPr>
@@ -9594,7 +10144,7 @@
         </w:tc>
         <w:tc>
           <w:tcPr>
-            <w:tcW w:w="11825" w:type="dxa"/>
+            <w:tcW w:w="11824" w:type="dxa"/>
             <w:tcBorders/>
             <w:vAlign w:val="center"/>
           </w:tcPr>
@@ -9617,7 +10167,7 @@
         <w:trPr/>
         <w:tc>
           <w:tcPr>
-            <w:tcW w:w="629" w:type="dxa"/>
+            <w:tcW w:w="627" w:type="dxa"/>
             <w:tcBorders/>
             <w:vAlign w:val="center"/>
           </w:tcPr>
@@ -9637,7 +10187,7 @@
         </w:tc>
         <w:tc>
           <w:tcPr>
-            <w:tcW w:w="5063" w:type="dxa"/>
+            <w:tcW w:w="5065" w:type="dxa"/>
             <w:tcBorders/>
             <w:vAlign w:val="center"/>
           </w:tcPr>
@@ -9659,7 +10209,7 @@
         </w:tc>
         <w:tc>
           <w:tcPr>
-            <w:tcW w:w="8974" w:type="dxa"/>
+            <w:tcW w:w="8973" w:type="dxa"/>
             <w:tcBorders/>
             <w:vAlign w:val="center"/>
           </w:tcPr>
@@ -9679,7 +10229,7 @@
         </w:tc>
         <w:tc>
           <w:tcPr>
-            <w:tcW w:w="11825" w:type="dxa"/>
+            <w:tcW w:w="11824" w:type="dxa"/>
             <w:tcBorders/>
             <w:vAlign w:val="center"/>
           </w:tcPr>
@@ -9702,7 +10252,7 @@
         <w:trPr/>
         <w:tc>
           <w:tcPr>
-            <w:tcW w:w="629" w:type="dxa"/>
+            <w:tcW w:w="627" w:type="dxa"/>
             <w:tcBorders/>
             <w:vAlign w:val="center"/>
           </w:tcPr>
@@ -9722,7 +10272,7 @@
         </w:tc>
         <w:tc>
           <w:tcPr>
-            <w:tcW w:w="5063" w:type="dxa"/>
+            <w:tcW w:w="5065" w:type="dxa"/>
             <w:tcBorders/>
             <w:vAlign w:val="center"/>
           </w:tcPr>
@@ -9744,7 +10294,7 @@
         </w:tc>
         <w:tc>
           <w:tcPr>
-            <w:tcW w:w="8974" w:type="dxa"/>
+            <w:tcW w:w="8973" w:type="dxa"/>
             <w:tcBorders/>
             <w:vAlign w:val="center"/>
           </w:tcPr>
@@ -9764,7 +10314,7 @@
         </w:tc>
         <w:tc>
           <w:tcPr>
-            <w:tcW w:w="11825" w:type="dxa"/>
+            <w:tcW w:w="11824" w:type="dxa"/>
             <w:tcBorders/>
             <w:vAlign w:val="center"/>
           </w:tcPr>
@@ -10393,6 +10943,7 @@
         </w:tabs>
         <w:ind w:left="1080" w:hanging="360"/>
       </w:pPr>
+      <w:rPr/>
     </w:lvl>
     <w:lvl w:ilvl="2">
       <w:start w:val="1"/>
@@ -10405,6 +10956,7 @@
         </w:tabs>
         <w:ind w:left="1440" w:hanging="360"/>
       </w:pPr>
+      <w:rPr/>
     </w:lvl>
     <w:lvl w:ilvl="3">
       <w:start w:val="1"/>
@@ -10417,6 +10969,7 @@
         </w:tabs>
         <w:ind w:left="1800" w:hanging="360"/>
       </w:pPr>
+      <w:rPr/>
     </w:lvl>
     <w:lvl w:ilvl="4">
       <w:start w:val="1"/>
@@ -10429,6 +10982,7 @@
         </w:tabs>
         <w:ind w:left="2160" w:hanging="360"/>
       </w:pPr>
+      <w:rPr/>
     </w:lvl>
     <w:lvl w:ilvl="5">
       <w:start w:val="1"/>
@@ -10441,6 +10995,7 @@
         </w:tabs>
         <w:ind w:left="2520" w:hanging="360"/>
       </w:pPr>
+      <w:rPr/>
     </w:lvl>
     <w:lvl w:ilvl="6">
       <w:start w:val="1"/>
@@ -10453,6 +11008,7 @@
         </w:tabs>
         <w:ind w:left="2880" w:hanging="360"/>
       </w:pPr>
+      <w:rPr/>
     </w:lvl>
     <w:lvl w:ilvl="7">
       <w:start w:val="1"/>
@@ -10465,6 +11021,7 @@
         </w:tabs>
         <w:ind w:left="3240" w:hanging="360"/>
       </w:pPr>
+      <w:rPr/>
     </w:lvl>
     <w:lvl w:ilvl="8">
       <w:start w:val="1"/>
@@ -10477,6 +11034,7 @@
         </w:tabs>
         <w:ind w:left="3600" w:hanging="360"/>
       </w:pPr>
+      <w:rPr/>
     </w:lvl>
   </w:abstractNum>
   <w:abstractNum w:abstractNumId="2">
@@ -10506,6 +11064,7 @@
         </w:tabs>
         <w:ind w:left="1080" w:hanging="360"/>
       </w:pPr>
+      <w:rPr/>
     </w:lvl>
     <w:lvl w:ilvl="2">
       <w:start w:val="1"/>
@@ -10518,6 +11077,7 @@
         </w:tabs>
         <w:ind w:left="1440" w:hanging="360"/>
       </w:pPr>
+      <w:rPr/>
     </w:lvl>
     <w:lvl w:ilvl="3">
       <w:start w:val="1"/>
@@ -10530,6 +11090,7 @@
         </w:tabs>
         <w:ind w:left="1800" w:hanging="360"/>
       </w:pPr>
+      <w:rPr/>
     </w:lvl>
     <w:lvl w:ilvl="4">
       <w:start w:val="1"/>
@@ -10542,6 +11103,7 @@
         </w:tabs>
         <w:ind w:left="2160" w:hanging="360"/>
       </w:pPr>
+      <w:rPr/>
     </w:lvl>
     <w:lvl w:ilvl="5">
       <w:start w:val="1"/>
@@ -10554,6 +11116,7 @@
         </w:tabs>
         <w:ind w:left="2520" w:hanging="360"/>
       </w:pPr>
+      <w:rPr/>
     </w:lvl>
     <w:lvl w:ilvl="6">
       <w:start w:val="1"/>
@@ -10566,6 +11129,7 @@
         </w:tabs>
         <w:ind w:left="2880" w:hanging="360"/>
       </w:pPr>
+      <w:rPr/>
     </w:lvl>
     <w:lvl w:ilvl="7">
       <w:start w:val="1"/>
@@ -10578,6 +11142,7 @@
         </w:tabs>
         <w:ind w:left="3240" w:hanging="360"/>
       </w:pPr>
+      <w:rPr/>
     </w:lvl>
     <w:lvl w:ilvl="8">
       <w:start w:val="1"/>
@@ -10590,6 +11155,7 @@
         </w:tabs>
         <w:ind w:left="3600" w:hanging="360"/>
       </w:pPr>
+      <w:rPr/>
     </w:lvl>
   </w:abstractNum>
   <w:abstractNum w:abstractNumId="3">
@@ -10619,6 +11185,7 @@
         </w:tabs>
         <w:ind w:left="1080" w:hanging="360"/>
       </w:pPr>
+      <w:rPr/>
     </w:lvl>
     <w:lvl w:ilvl="2">
       <w:start w:val="1"/>
@@ -10631,6 +11198,7 @@
         </w:tabs>
         <w:ind w:left="1440" w:hanging="360"/>
       </w:pPr>
+      <w:rPr/>
     </w:lvl>
     <w:lvl w:ilvl="3">
       <w:start w:val="1"/>
@@ -10643,6 +11211,7 @@
         </w:tabs>
         <w:ind w:left="1800" w:hanging="360"/>
       </w:pPr>
+      <w:rPr/>
     </w:lvl>
     <w:lvl w:ilvl="4">
       <w:start w:val="1"/>
@@ -10655,6 +11224,7 @@
         </w:tabs>
         <w:ind w:left="2160" w:hanging="360"/>
       </w:pPr>
+      <w:rPr/>
     </w:lvl>
     <w:lvl w:ilvl="5">
       <w:start w:val="1"/>
@@ -10667,6 +11237,7 @@
         </w:tabs>
         <w:ind w:left="2520" w:hanging="360"/>
       </w:pPr>
+      <w:rPr/>
     </w:lvl>
     <w:lvl w:ilvl="6">
       <w:start w:val="1"/>
@@ -10679,6 +11250,7 @@
         </w:tabs>
         <w:ind w:left="2880" w:hanging="360"/>
       </w:pPr>
+      <w:rPr/>
     </w:lvl>
     <w:lvl w:ilvl="7">
       <w:start w:val="1"/>
@@ -10691,6 +11263,7 @@
         </w:tabs>
         <w:ind w:left="3240" w:hanging="360"/>
       </w:pPr>
+      <w:rPr/>
     </w:lvl>
     <w:lvl w:ilvl="8">
       <w:start w:val="1"/>
@@ -10703,6 +11276,7 @@
         </w:tabs>
         <w:ind w:left="3600" w:hanging="360"/>
       </w:pPr>
+      <w:rPr/>
     </w:lvl>
   </w:abstractNum>
   <w:abstractNum w:abstractNumId="4">
@@ -10730,6 +11304,7 @@
         </w:tabs>
         <w:ind w:left="1080" w:hanging="360"/>
       </w:pPr>
+      <w:rPr/>
     </w:lvl>
     <w:lvl w:ilvl="2">
       <w:start w:val="1"/>
@@ -10742,6 +11317,7 @@
         </w:tabs>
         <w:ind w:left="1440" w:hanging="360"/>
       </w:pPr>
+      <w:rPr/>
     </w:lvl>
     <w:lvl w:ilvl="3">
       <w:start w:val="1"/>
@@ -10754,6 +11330,7 @@
         </w:tabs>
         <w:ind w:left="1800" w:hanging="360"/>
       </w:pPr>
+      <w:rPr/>
     </w:lvl>
     <w:lvl w:ilvl="4">
       <w:start w:val="1"/>
@@ -10766,6 +11343,7 @@
         </w:tabs>
         <w:ind w:left="2160" w:hanging="360"/>
       </w:pPr>
+      <w:rPr/>
     </w:lvl>
     <w:lvl w:ilvl="5">
       <w:start w:val="1"/>
@@ -10778,6 +11356,7 @@
         </w:tabs>
         <w:ind w:left="2520" w:hanging="360"/>
       </w:pPr>
+      <w:rPr/>
     </w:lvl>
     <w:lvl w:ilvl="6">
       <w:start w:val="1"/>
@@ -10790,6 +11369,7 @@
         </w:tabs>
         <w:ind w:left="2880" w:hanging="360"/>
       </w:pPr>
+      <w:rPr/>
     </w:lvl>
     <w:lvl w:ilvl="7">
       <w:start w:val="1"/>
@@ -10802,6 +11382,7 @@
         </w:tabs>
         <w:ind w:left="3240" w:hanging="360"/>
       </w:pPr>
+      <w:rPr/>
     </w:lvl>
     <w:lvl w:ilvl="8">
       <w:start w:val="1"/>
@@ -10814,6 +11395,7 @@
         </w:tabs>
         <w:ind w:left="3600" w:hanging="360"/>
       </w:pPr>
+      <w:rPr/>
     </w:lvl>
   </w:abstractNum>
   <w:abstractNum w:abstractNumId="5">
@@ -10841,6 +11423,7 @@
         </w:tabs>
         <w:ind w:left="1080" w:hanging="360"/>
       </w:pPr>
+      <w:rPr/>
     </w:lvl>
     <w:lvl w:ilvl="2">
       <w:start w:val="1"/>
@@ -10853,6 +11436,7 @@
         </w:tabs>
         <w:ind w:left="1440" w:hanging="360"/>
       </w:pPr>
+      <w:rPr/>
     </w:lvl>
     <w:lvl w:ilvl="3">
       <w:start w:val="1"/>
@@ -10865,6 +11449,7 @@
         </w:tabs>
         <w:ind w:left="1800" w:hanging="360"/>
       </w:pPr>
+      <w:rPr/>
     </w:lvl>
     <w:lvl w:ilvl="4">
       <w:start w:val="1"/>
@@ -10877,6 +11462,7 @@
         </w:tabs>
         <w:ind w:left="2160" w:hanging="360"/>
       </w:pPr>
+      <w:rPr/>
     </w:lvl>
     <w:lvl w:ilvl="5">
       <w:start w:val="1"/>
@@ -10889,6 +11475,7 @@
         </w:tabs>
         <w:ind w:left="2520" w:hanging="360"/>
       </w:pPr>
+      <w:rPr/>
     </w:lvl>
     <w:lvl w:ilvl="6">
       <w:start w:val="1"/>
@@ -10901,6 +11488,7 @@
         </w:tabs>
         <w:ind w:left="2880" w:hanging="360"/>
       </w:pPr>
+      <w:rPr/>
     </w:lvl>
     <w:lvl w:ilvl="7">
       <w:start w:val="1"/>
@@ -10913,6 +11501,7 @@
         </w:tabs>
         <w:ind w:left="3240" w:hanging="360"/>
       </w:pPr>
+      <w:rPr/>
     </w:lvl>
     <w:lvl w:ilvl="8">
       <w:start w:val="1"/>
@@ -10925,6 +11514,7 @@
         </w:tabs>
         <w:ind w:left="3600" w:hanging="360"/>
       </w:pPr>
+      <w:rPr/>
     </w:lvl>
   </w:abstractNum>
   <w:abstractNum w:abstractNumId="6">
@@ -10952,6 +11542,7 @@
         </w:tabs>
         <w:ind w:left="1080" w:hanging="360"/>
       </w:pPr>
+      <w:rPr/>
     </w:lvl>
     <w:lvl w:ilvl="2">
       <w:start w:val="1"/>
@@ -10964,6 +11555,7 @@
         </w:tabs>
         <w:ind w:left="1440" w:hanging="360"/>
       </w:pPr>
+      <w:rPr/>
     </w:lvl>
     <w:lvl w:ilvl="3">
       <w:start w:val="1"/>
@@ -10976,6 +11568,7 @@
         </w:tabs>
         <w:ind w:left="1800" w:hanging="360"/>
       </w:pPr>
+      <w:rPr/>
     </w:lvl>
     <w:lvl w:ilvl="4">
       <w:start w:val="1"/>
@@ -10988,6 +11581,7 @@
         </w:tabs>
         <w:ind w:left="2160" w:hanging="360"/>
       </w:pPr>
+      <w:rPr/>
     </w:lvl>
     <w:lvl w:ilvl="5">
       <w:start w:val="1"/>
@@ -11000,6 +11594,7 @@
         </w:tabs>
         <w:ind w:left="2520" w:hanging="360"/>
       </w:pPr>
+      <w:rPr/>
     </w:lvl>
     <w:lvl w:ilvl="6">
       <w:start w:val="1"/>
@@ -11012,6 +11607,7 @@
         </w:tabs>
         <w:ind w:left="2880" w:hanging="360"/>
       </w:pPr>
+      <w:rPr/>
     </w:lvl>
     <w:lvl w:ilvl="7">
       <w:start w:val="1"/>
@@ -11024,6 +11620,7 @@
         </w:tabs>
         <w:ind w:left="3240" w:hanging="360"/>
       </w:pPr>
+      <w:rPr/>
     </w:lvl>
     <w:lvl w:ilvl="8">
       <w:start w:val="1"/>
@@ -11036,6 +11633,7 @@
         </w:tabs>
         <w:ind w:left="3600" w:hanging="360"/>
       </w:pPr>
+      <w:rPr/>
     </w:lvl>
   </w:abstractNum>
   <w:abstractNum w:abstractNumId="7">
@@ -11186,7 +11784,7 @@
   <w:docDefaults>
     <w:rPrDefault>
       <w:rPr>
-        <w:rFonts w:ascii="Cambria" w:hAnsi="Cambria" w:eastAsia="ＭＳ 明朝" w:cs="" w:asciiTheme="minorHAnsi" w:cstheme="minorBidi" w:eastAsiaTheme="minorEastAsia" w:hAnsiTheme="minorHAnsi"/>
+        <w:rFonts w:ascii="Cambria" w:hAnsi="Cambria" w:eastAsia="" w:cs="" w:asciiTheme="minorHAnsi" w:cstheme="minorBidi" w:eastAsiaTheme="minorEastAsia" w:hAnsiTheme="minorHAnsi"/>
         <w:sz w:val="22"/>
         <w:szCs w:val="22"/>
         <w:lang w:val="en-US" w:eastAsia="en-US" w:bidi="ar-SA"/>
@@ -11343,12 +11941,13 @@
     <w:rsid w:val="00fc693f"/>
     <w:pPr>
       <w:widowControl/>
+      <w:suppressAutoHyphens w:val="true"/>
       <w:bidi w:val="0"/>
       <w:spacing w:lineRule="auto" w:line="276" w:before="0" w:after="200"/>
       <w:jc w:val="left"/>
     </w:pPr>
     <w:rPr>
-      <w:rFonts w:ascii="Aptos" w:hAnsi="Aptos" w:eastAsia="ＭＳ 明朝" w:cs="" w:cstheme="minorBidi" w:eastAsiaTheme="minorEastAsia"/>
+      <w:rFonts w:ascii="Aptos" w:hAnsi="Aptos" w:eastAsia="" w:cs="" w:cstheme="minorBidi" w:eastAsiaTheme="minorEastAsia"/>
       <w:color w:val="auto"/>
       <w:kern w:val="0"/>
       <w:sz w:val="20"/>
@@ -11371,7 +11970,7 @@
       <w:outlineLvl w:val="0"/>
     </w:pPr>
     <w:rPr>
-      <w:rFonts w:ascii="Calibri" w:hAnsi="Calibri" w:eastAsia="ＭＳ ゴシック" w:cs="" w:asciiTheme="majorHAnsi" w:cstheme="majorBidi" w:eastAsiaTheme="majorEastAsia" w:hAnsiTheme="majorHAnsi"/>
+      <w:rFonts w:ascii="Calibri" w:hAnsi="Calibri" w:eastAsia="" w:cs="" w:asciiTheme="majorHAnsi" w:cstheme="majorBidi" w:eastAsiaTheme="majorEastAsia" w:hAnsiTheme="majorHAnsi"/>
       <w:b/>
       <w:bCs/>
       <w:color w:themeColor="accent1" w:themeShade="bf" w:val="365F91"/>
@@ -11395,7 +11994,7 @@
       <w:outlineLvl w:val="1"/>
     </w:pPr>
     <w:rPr>
-      <w:rFonts w:ascii="Calibri" w:hAnsi="Calibri" w:eastAsia="ＭＳ ゴシック" w:cs="" w:asciiTheme="majorHAnsi" w:cstheme="majorBidi" w:eastAsiaTheme="majorEastAsia" w:hAnsiTheme="majorHAnsi"/>
+      <w:rFonts w:ascii="Calibri" w:hAnsi="Calibri" w:eastAsia="" w:cs="" w:asciiTheme="majorHAnsi" w:cstheme="majorBidi" w:eastAsiaTheme="majorEastAsia" w:hAnsiTheme="majorHAnsi"/>
       <w:b/>
       <w:bCs/>
       <w:color w:themeColor="accent1" w:val="4F81BD"/>
@@ -11419,7 +12018,7 @@
       <w:outlineLvl w:val="2"/>
     </w:pPr>
     <w:rPr>
-      <w:rFonts w:ascii="Calibri" w:hAnsi="Calibri" w:eastAsia="ＭＳ ゴシック" w:cs="" w:asciiTheme="majorHAnsi" w:cstheme="majorBidi" w:eastAsiaTheme="majorEastAsia" w:hAnsiTheme="majorHAnsi"/>
+      <w:rFonts w:ascii="Calibri" w:hAnsi="Calibri" w:eastAsia="" w:cs="" w:asciiTheme="majorHAnsi" w:cstheme="majorBidi" w:eastAsiaTheme="majorEastAsia" w:hAnsiTheme="majorHAnsi"/>
       <w:b/>
       <w:bCs/>
       <w:color w:themeColor="accent1" w:val="4F81BD"/>
@@ -11442,7 +12041,7 @@
       <w:outlineLvl w:val="3"/>
     </w:pPr>
     <w:rPr>
-      <w:rFonts w:ascii="Calibri" w:hAnsi="Calibri" w:eastAsia="ＭＳ ゴシック" w:cs="" w:asciiTheme="majorHAnsi" w:cstheme="majorBidi" w:eastAsiaTheme="majorEastAsia" w:hAnsiTheme="majorHAnsi"/>
+      <w:rFonts w:ascii="Calibri" w:hAnsi="Calibri" w:eastAsia="" w:cs="" w:asciiTheme="majorHAnsi" w:cstheme="majorBidi" w:eastAsiaTheme="majorEastAsia" w:hAnsiTheme="majorHAnsi"/>
       <w:b/>
       <w:bCs/>
       <w:i/>
@@ -11467,7 +12066,7 @@
       <w:outlineLvl w:val="4"/>
     </w:pPr>
     <w:rPr>
-      <w:rFonts w:ascii="Calibri" w:hAnsi="Calibri" w:eastAsia="ＭＳ ゴシック" w:cs="" w:asciiTheme="majorHAnsi" w:cstheme="majorBidi" w:eastAsiaTheme="majorEastAsia" w:hAnsiTheme="majorHAnsi"/>
+      <w:rFonts w:ascii="Calibri" w:hAnsi="Calibri" w:eastAsia="" w:cs="" w:asciiTheme="majorHAnsi" w:cstheme="majorBidi" w:eastAsiaTheme="majorEastAsia" w:hAnsiTheme="majorHAnsi"/>
       <w:color w:themeColor="accent1" w:themeShade="7f" w:val="243F60"/>
     </w:rPr>
   </w:style>
@@ -11488,7 +12087,7 @@
       <w:outlineLvl w:val="5"/>
     </w:pPr>
     <w:rPr>
-      <w:rFonts w:ascii="Calibri" w:hAnsi="Calibri" w:eastAsia="ＭＳ ゴシック" w:cs="" w:asciiTheme="majorHAnsi" w:cstheme="majorBidi" w:eastAsiaTheme="majorEastAsia" w:hAnsiTheme="majorHAnsi"/>
+      <w:rFonts w:ascii="Calibri" w:hAnsi="Calibri" w:eastAsia="" w:cs="" w:asciiTheme="majorHAnsi" w:cstheme="majorBidi" w:eastAsiaTheme="majorEastAsia" w:hAnsiTheme="majorHAnsi"/>
       <w:i/>
       <w:iCs/>
       <w:color w:themeColor="accent1" w:themeShade="7f" w:val="243F60"/>
@@ -11511,7 +12110,7 @@
       <w:outlineLvl w:val="6"/>
     </w:pPr>
     <w:rPr>
-      <w:rFonts w:ascii="Calibri" w:hAnsi="Calibri" w:eastAsia="ＭＳ ゴシック" w:cs="" w:asciiTheme="majorHAnsi" w:cstheme="majorBidi" w:eastAsiaTheme="majorEastAsia" w:hAnsiTheme="majorHAnsi"/>
+      <w:rFonts w:ascii="Calibri" w:hAnsi="Calibri" w:eastAsia="" w:cs="" w:asciiTheme="majorHAnsi" w:cstheme="majorBidi" w:eastAsiaTheme="majorEastAsia" w:hAnsiTheme="majorHAnsi"/>
       <w:i/>
       <w:iCs/>
       <w:color w:themeColor="text1" w:themeTint="bf" w:val="404040"/>
@@ -11534,7 +12133,7 @@
       <w:outlineLvl w:val="7"/>
     </w:pPr>
     <w:rPr>
-      <w:rFonts w:ascii="Calibri" w:hAnsi="Calibri" w:eastAsia="ＭＳ ゴシック" w:cs="" w:asciiTheme="majorHAnsi" w:cstheme="majorBidi" w:eastAsiaTheme="majorEastAsia" w:hAnsiTheme="majorHAnsi"/>
+      <w:rFonts w:ascii="Calibri" w:hAnsi="Calibri" w:eastAsia="" w:cs="" w:asciiTheme="majorHAnsi" w:cstheme="majorBidi" w:eastAsiaTheme="majorEastAsia" w:hAnsiTheme="majorHAnsi"/>
       <w:color w:themeColor="accent1" w:val="4F81BD"/>
       <w:sz w:val="20"/>
       <w:szCs w:val="20"/>
@@ -11557,7 +12156,7 @@
       <w:outlineLvl w:val="8"/>
     </w:pPr>
     <w:rPr>
-      <w:rFonts w:ascii="Calibri" w:hAnsi="Calibri" w:eastAsia="ＭＳ ゴシック" w:cs="" w:asciiTheme="majorHAnsi" w:cstheme="majorBidi" w:eastAsiaTheme="majorEastAsia" w:hAnsiTheme="majorHAnsi"/>
+      <w:rFonts w:ascii="Calibri" w:hAnsi="Calibri" w:eastAsia="" w:cs="" w:asciiTheme="majorHAnsi" w:cstheme="majorBidi" w:eastAsiaTheme="majorEastAsia" w:hAnsiTheme="majorHAnsi"/>
       <w:i/>
       <w:iCs/>
       <w:color w:themeColor="text1" w:themeTint="bf" w:val="404040"/>
@@ -11599,7 +12198,7 @@
     <w:qFormat/>
     <w:rsid w:val="00fc693f"/>
     <w:rPr>
-      <w:rFonts w:ascii="Calibri" w:hAnsi="Calibri" w:eastAsia="ＭＳ ゴシック" w:cs="" w:asciiTheme="majorHAnsi" w:cstheme="majorBidi" w:eastAsiaTheme="majorEastAsia" w:hAnsiTheme="majorHAnsi"/>
+      <w:rFonts w:ascii="Calibri" w:hAnsi="Calibri" w:eastAsia="" w:cs="" w:asciiTheme="majorHAnsi" w:cstheme="majorBidi" w:eastAsiaTheme="majorEastAsia" w:hAnsiTheme="majorHAnsi"/>
       <w:b/>
       <w:bCs/>
       <w:color w:themeColor="accent1" w:themeShade="bf" w:val="365F91"/>
@@ -11615,7 +12214,7 @@
     <w:qFormat/>
     <w:rsid w:val="00fc693f"/>
     <w:rPr>
-      <w:rFonts w:ascii="Calibri" w:hAnsi="Calibri" w:eastAsia="ＭＳ ゴシック" w:cs="" w:asciiTheme="majorHAnsi" w:cstheme="majorBidi" w:eastAsiaTheme="majorEastAsia" w:hAnsiTheme="majorHAnsi"/>
+      <w:rFonts w:ascii="Calibri" w:hAnsi="Calibri" w:eastAsia="" w:cs="" w:asciiTheme="majorHAnsi" w:cstheme="majorBidi" w:eastAsiaTheme="majorEastAsia" w:hAnsiTheme="majorHAnsi"/>
       <w:b/>
       <w:bCs/>
       <w:color w:themeColor="accent1" w:val="4F81BD"/>
@@ -11631,7 +12230,7 @@
     <w:qFormat/>
     <w:rsid w:val="00fc693f"/>
     <w:rPr>
-      <w:rFonts w:ascii="Calibri" w:hAnsi="Calibri" w:eastAsia="ＭＳ ゴシック" w:cs="" w:asciiTheme="majorHAnsi" w:cstheme="majorBidi" w:eastAsiaTheme="majorEastAsia" w:hAnsiTheme="majorHAnsi"/>
+      <w:rFonts w:ascii="Calibri" w:hAnsi="Calibri" w:eastAsia="" w:cs="" w:asciiTheme="majorHAnsi" w:cstheme="majorBidi" w:eastAsiaTheme="majorEastAsia" w:hAnsiTheme="majorHAnsi"/>
       <w:b/>
       <w:bCs/>
       <w:color w:themeColor="accent1" w:val="4F81BD"/>
@@ -11645,7 +12244,7 @@
     <w:qFormat/>
     <w:rsid w:val="00fc693f"/>
     <w:rPr>
-      <w:rFonts w:ascii="Calibri" w:hAnsi="Calibri" w:eastAsia="ＭＳ ゴシック" w:cs="" w:asciiTheme="majorHAnsi" w:cstheme="majorBidi" w:eastAsiaTheme="majorEastAsia" w:hAnsiTheme="majorHAnsi"/>
+      <w:rFonts w:ascii="Calibri" w:hAnsi="Calibri" w:eastAsia="" w:cs="" w:asciiTheme="majorHAnsi" w:cstheme="majorBidi" w:eastAsiaTheme="majorEastAsia" w:hAnsiTheme="majorHAnsi"/>
       <w:color w:themeColor="text2" w:themeShade="bf" w:val="17365D"/>
       <w:spacing w:val="5"/>
       <w:kern w:val="2"/>
@@ -11661,7 +12260,7 @@
     <w:qFormat/>
     <w:rsid w:val="00fc693f"/>
     <w:rPr>
-      <w:rFonts w:ascii="Calibri" w:hAnsi="Calibri" w:eastAsia="ＭＳ ゴシック" w:cs="" w:asciiTheme="majorHAnsi" w:cstheme="majorBidi" w:eastAsiaTheme="majorEastAsia" w:hAnsiTheme="majorHAnsi"/>
+      <w:rFonts w:ascii="Calibri" w:hAnsi="Calibri" w:eastAsia="" w:cs="" w:asciiTheme="majorHAnsi" w:cstheme="majorBidi" w:eastAsiaTheme="majorEastAsia" w:hAnsiTheme="majorHAnsi"/>
       <w:i/>
       <w:iCs/>
       <w:color w:themeColor="accent1" w:val="4F81BD"/>
@@ -11734,7 +12333,7 @@
     <w:qFormat/>
     <w:rsid w:val="00fc693f"/>
     <w:rPr>
-      <w:rFonts w:ascii="Calibri" w:hAnsi="Calibri" w:eastAsia="ＭＳ ゴシック" w:cs="" w:asciiTheme="majorHAnsi" w:cstheme="majorBidi" w:eastAsiaTheme="majorEastAsia" w:hAnsiTheme="majorHAnsi"/>
+      <w:rFonts w:ascii="Calibri" w:hAnsi="Calibri" w:eastAsia="" w:cs="" w:asciiTheme="majorHAnsi" w:cstheme="majorBidi" w:eastAsiaTheme="majorEastAsia" w:hAnsiTheme="majorHAnsi"/>
       <w:b/>
       <w:bCs/>
       <w:i/>
@@ -11751,7 +12350,7 @@
     <w:qFormat/>
     <w:rsid w:val="00fc693f"/>
     <w:rPr>
-      <w:rFonts w:ascii="Calibri" w:hAnsi="Calibri" w:eastAsia="ＭＳ ゴシック" w:cs="" w:asciiTheme="majorHAnsi" w:cstheme="majorBidi" w:eastAsiaTheme="majorEastAsia" w:hAnsiTheme="majorHAnsi"/>
+      <w:rFonts w:ascii="Calibri" w:hAnsi="Calibri" w:eastAsia="" w:cs="" w:asciiTheme="majorHAnsi" w:cstheme="majorBidi" w:eastAsiaTheme="majorEastAsia" w:hAnsiTheme="majorHAnsi"/>
       <w:color w:themeColor="accent1" w:themeShade="7f" w:val="243F60"/>
     </w:rPr>
   </w:style>
@@ -11764,7 +12363,7 @@
     <w:qFormat/>
     <w:rsid w:val="00fc693f"/>
     <w:rPr>
-      <w:rFonts w:ascii="Calibri" w:hAnsi="Calibri" w:eastAsia="ＭＳ ゴシック" w:cs="" w:asciiTheme="majorHAnsi" w:cstheme="majorBidi" w:eastAsiaTheme="majorEastAsia" w:hAnsiTheme="majorHAnsi"/>
+      <w:rFonts w:ascii="Calibri" w:hAnsi="Calibri" w:eastAsia="" w:cs="" w:asciiTheme="majorHAnsi" w:cstheme="majorBidi" w:eastAsiaTheme="majorEastAsia" w:hAnsiTheme="majorHAnsi"/>
       <w:i/>
       <w:iCs/>
       <w:color w:themeColor="accent1" w:themeShade="7f" w:val="243F60"/>
@@ -11779,7 +12378,7 @@
     <w:qFormat/>
     <w:rsid w:val="00fc693f"/>
     <w:rPr>
-      <w:rFonts w:ascii="Calibri" w:hAnsi="Calibri" w:eastAsia="ＭＳ ゴシック" w:cs="" w:asciiTheme="majorHAnsi" w:cstheme="majorBidi" w:eastAsiaTheme="majorEastAsia" w:hAnsiTheme="majorHAnsi"/>
+      <w:rFonts w:ascii="Calibri" w:hAnsi="Calibri" w:eastAsia="" w:cs="" w:asciiTheme="majorHAnsi" w:cstheme="majorBidi" w:eastAsiaTheme="majorEastAsia" w:hAnsiTheme="majorHAnsi"/>
       <w:i/>
       <w:iCs/>
       <w:color w:themeColor="text1" w:themeTint="bf" w:val="404040"/>
@@ -11794,7 +12393,7 @@
     <w:qFormat/>
     <w:rsid w:val="00fc693f"/>
     <w:rPr>
-      <w:rFonts w:ascii="Calibri" w:hAnsi="Calibri" w:eastAsia="ＭＳ ゴシック" w:cs="" w:asciiTheme="majorHAnsi" w:cstheme="majorBidi" w:eastAsiaTheme="majorEastAsia" w:hAnsiTheme="majorHAnsi"/>
+      <w:rFonts w:ascii="Calibri" w:hAnsi="Calibri" w:eastAsia="" w:cs="" w:asciiTheme="majorHAnsi" w:cstheme="majorBidi" w:eastAsiaTheme="majorEastAsia" w:hAnsiTheme="majorHAnsi"/>
       <w:color w:themeColor="accent1" w:val="4F81BD"/>
       <w:sz w:val="20"/>
       <w:szCs w:val="20"/>
@@ -11809,7 +12408,7 @@
     <w:qFormat/>
     <w:rsid w:val="00fc693f"/>
     <w:rPr>
-      <w:rFonts w:ascii="Calibri" w:hAnsi="Calibri" w:eastAsia="ＭＳ ゴシック" w:cs="" w:asciiTheme="majorHAnsi" w:cstheme="majorBidi" w:eastAsiaTheme="majorEastAsia" w:hAnsiTheme="majorHAnsi"/>
+      <w:rFonts w:ascii="Calibri" w:hAnsi="Calibri" w:eastAsia="" w:cs="" w:asciiTheme="majorHAnsi" w:cstheme="majorBidi" w:eastAsiaTheme="majorEastAsia" w:hAnsiTheme="majorHAnsi"/>
       <w:i/>
       <w:iCs/>
       <w:color w:themeColor="text1" w:themeTint="bf" w:val="404040"/>
@@ -12039,12 +12638,13 @@
     <w:rsid w:val="00fc693f"/>
     <w:pPr>
       <w:widowControl/>
+      <w:suppressAutoHyphens w:val="true"/>
       <w:bidi w:val="0"/>
       <w:spacing w:lineRule="auto" w:line="240" w:before="0" w:after="0"/>
       <w:jc w:val="left"/>
     </w:pPr>
     <w:rPr>
-      <w:rFonts w:ascii="Cambria" w:hAnsi="Cambria" w:eastAsia="ＭＳ 明朝" w:cs="" w:asciiTheme="minorHAnsi" w:cstheme="minorBidi" w:eastAsiaTheme="minorEastAsia" w:hAnsiTheme="minorHAnsi"/>
+      <w:rFonts w:ascii="Cambria" w:hAnsi="Cambria" w:eastAsia="" w:cs="" w:asciiTheme="minorHAnsi" w:cstheme="minorBidi" w:eastAsiaTheme="minorEastAsia" w:hAnsiTheme="minorHAnsi"/>
       <w:color w:val="auto"/>
       <w:kern w:val="0"/>
       <w:sz w:val="22"/>
@@ -12068,7 +12668,7 @@
       <w:contextualSpacing/>
     </w:pPr>
     <w:rPr>
-      <w:rFonts w:ascii="Calibri" w:hAnsi="Calibri" w:eastAsia="ＭＳ ゴシック" w:cs="" w:asciiTheme="majorHAnsi" w:cstheme="majorBidi" w:eastAsiaTheme="majorEastAsia" w:hAnsiTheme="majorHAnsi"/>
+      <w:rFonts w:ascii="Calibri" w:hAnsi="Calibri" w:eastAsia="" w:cs="" w:asciiTheme="majorHAnsi" w:cstheme="majorBidi" w:eastAsiaTheme="majorEastAsia" w:hAnsiTheme="majorHAnsi"/>
       <w:color w:themeColor="text2" w:themeShade="bf" w:val="17365D"/>
       <w:spacing w:val="5"/>
       <w:kern w:val="2"/>
@@ -12086,7 +12686,7 @@
     <w:rsid w:val="00fc693f"/>
     <w:pPr/>
     <w:rPr>
-      <w:rFonts w:ascii="Calibri" w:hAnsi="Calibri" w:eastAsia="ＭＳ ゴシック" w:cs="" w:asciiTheme="majorHAnsi" w:cstheme="majorBidi" w:eastAsiaTheme="majorEastAsia" w:hAnsiTheme="majorHAnsi"/>
+      <w:rFonts w:ascii="Calibri" w:hAnsi="Calibri" w:eastAsia="" w:cs="" w:asciiTheme="majorHAnsi" w:cstheme="majorBidi" w:eastAsiaTheme="majorEastAsia" w:hAnsiTheme="majorHAnsi"/>
       <w:i/>
       <w:iCs/>
       <w:color w:themeColor="accent1" w:val="4F81BD"/>
@@ -12319,12 +12919,13 @@
         <w:tab w:val="left" w:pos="3456" w:leader="none"/>
         <w:tab w:val="left" w:pos="4032" w:leader="none"/>
       </w:tabs>
+      <w:suppressAutoHyphens w:val="true"/>
       <w:bidi w:val="0"/>
       <w:spacing w:lineRule="auto" w:line="276" w:before="0" w:after="200"/>
       <w:jc w:val="left"/>
     </w:pPr>
     <w:rPr>
-      <w:rFonts w:ascii="Courier" w:hAnsi="Courier" w:eastAsia="ＭＳ 明朝" w:cs="" w:cstheme="minorBidi" w:eastAsiaTheme="minorEastAsia"/>
+      <w:rFonts w:ascii="Courier" w:hAnsi="Courier" w:eastAsia="" w:cs="" w:cstheme="minorBidi" w:eastAsiaTheme="minorEastAsia"/>
       <w:color w:val="auto"/>
       <w:kern w:val="0"/>
       <w:sz w:val="20"/>
@@ -15545,7 +16146,6 @@
       <w:pPr>
         <w:spacing w:before="0" w:after="0" w:line="240" w:lineRule="auto"/>
       </w:pPr>
-      <w:rPr/>
       <w:tblPr/>
       <w:tcPr>
         <w:tcBorders>
@@ -15691,7 +16291,6 @@
       <w:pPr>
         <w:spacing w:before="0" w:after="0" w:line="240" w:lineRule="auto"/>
       </w:pPr>
-      <w:rPr/>
       <w:tblPr/>
       <w:tcPr>
         <w:tcBorders>
@@ -15837,7 +16436,6 @@
       <w:pPr>
         <w:spacing w:before="0" w:after="0" w:line="240" w:lineRule="auto"/>
       </w:pPr>
-      <w:rPr/>
       <w:tblPr/>
       <w:tcPr>
         <w:tcBorders>
@@ -15983,7 +16581,6 @@
       <w:pPr>
         <w:spacing w:before="0" w:after="0" w:line="240" w:lineRule="auto"/>
       </w:pPr>
-      <w:rPr/>
       <w:tblPr/>
       <w:tcPr>
         <w:tcBorders>
@@ -16129,7 +16726,6 @@
       <w:pPr>
         <w:spacing w:before="0" w:after="0" w:line="240" w:lineRule="auto"/>
       </w:pPr>
-      <w:rPr/>
       <w:tblPr/>
       <w:tcPr>
         <w:tcBorders>
@@ -16275,7 +16871,6 @@
       <w:pPr>
         <w:spacing w:before="0" w:after="0" w:line="240" w:lineRule="auto"/>
       </w:pPr>
-      <w:rPr/>
       <w:tblPr/>
       <w:tcPr>
         <w:tcBorders>
@@ -16421,7 +17016,6 @@
       <w:pPr>
         <w:spacing w:before="0" w:after="0" w:line="240" w:lineRule="auto"/>
       </w:pPr>
-      <w:rPr/>
       <w:tblPr/>
       <w:tcPr>
         <w:tcBorders>

</xml_diff>